<commit_message>
Teoria y ETL KNIME
</commit_message>
<xml_diff>
--- a/proyecto analisis.docx
+++ b/proyecto analisis.docx
@@ -1,6 +1,6 @@
 
 <file path=word/document.xml><?xml version="1.0" encoding="utf-8"?>
-<w:document xmlns:wpc="http://schemas.microsoft.com/office/word/2010/wordprocessingCanvas" xmlns:cx="http://schemas.microsoft.com/office/drawing/2014/chartex" xmlns:cx1="http://schemas.microsoft.com/office/drawing/2015/9/8/chartex" xmlns:cx2="http://schemas.microsoft.com/office/drawing/2015/10/21/chartex" xmlns:cx3="http://schemas.microsoft.com/office/drawing/2016/5/9/chartex" xmlns:cx4="http://schemas.microsoft.com/office/drawing/2016/5/10/chartex" xmlns:cx5="http://schemas.microsoft.com/office/drawing/2016/5/11/chartex" xmlns:cx6="http://schemas.microsoft.com/office/drawing/2016/5/12/chartex" xmlns:cx7="http://schemas.microsoft.com/office/drawing/2016/5/13/chartex" xmlns:cx8="http://schemas.microsoft.com/office/drawing/2016/5/14/chartex" xmlns:mc="http://schemas.openxmlformats.org/markup-compatibility/2006" xmlns:aink="http://schemas.microsoft.com/office/drawing/2016/ink" xmlns:am3d="http://schemas.microsoft.com/office/drawing/2017/model3d" xmlns:o="urn:schemas-microsoft-com:office:office" xmlns:oel="http://schemas.microsoft.com/office/2019/extlst" xmlns:r="http://schemas.openxmlformats.org/officeDocument/2006/relationships" xmlns:m="http://schemas.openxmlformats.org/officeDocument/2006/math" xmlns:v="urn:schemas-microsoft-com:vml" xmlns:wp14="http://schemas.microsoft.com/office/word/2010/wordprocessingDrawing" xmlns:wp="http://schemas.openxmlformats.org/drawingml/2006/wordprocessingDrawing" xmlns:w10="urn:schemas-microsoft-com:office:word" xmlns:w="http://schemas.openxmlformats.org/wordprocessingml/2006/main" xmlns:w14="http://schemas.microsoft.com/office/word/2010/wordml" xmlns:w15="http://schemas.microsoft.com/office/word/2012/wordml" xmlns:w16cex="http://schemas.microsoft.com/office/word/2018/wordml/cex" xmlns:w16cid="http://schemas.microsoft.com/office/word/2016/wordml/cid" xmlns:w16="http://schemas.microsoft.com/office/word/2018/wordml" xmlns:w16sdtdh="http://schemas.microsoft.com/office/word/2020/wordml/sdtdatahash" xmlns:w16se="http://schemas.microsoft.com/office/word/2015/wordml/symex" xmlns:wpg="http://schemas.microsoft.com/office/word/2010/wordprocessingGroup" xmlns:wpi="http://schemas.microsoft.com/office/word/2010/wordprocessingInk" xmlns:wne="http://schemas.microsoft.com/office/word/2006/wordml" xmlns:wps="http://schemas.microsoft.com/office/word/2010/wordprocessingShape" mc:Ignorable="w14 w15 w16se w16cid w16 w16cex w16sdtdh wp14">
+<w:document xmlns:wpc="http://schemas.microsoft.com/office/word/2010/wordprocessingCanvas" xmlns:cx="http://schemas.microsoft.com/office/drawing/2014/chartex" xmlns:cx1="http://schemas.microsoft.com/office/drawing/2015/9/8/chartex" xmlns:cx2="http://schemas.microsoft.com/office/drawing/2015/10/21/chartex" xmlns:cx3="http://schemas.microsoft.com/office/drawing/2016/5/9/chartex" xmlns:cx4="http://schemas.microsoft.com/office/drawing/2016/5/10/chartex" xmlns:cx5="http://schemas.microsoft.com/office/drawing/2016/5/11/chartex" xmlns:cx6="http://schemas.microsoft.com/office/drawing/2016/5/12/chartex" xmlns:cx7="http://schemas.microsoft.com/office/drawing/2016/5/13/chartex" xmlns:cx8="http://schemas.microsoft.com/office/drawing/2016/5/14/chartex" xmlns:mc="http://schemas.openxmlformats.org/markup-compatibility/2006" xmlns:aink="http://schemas.microsoft.com/office/drawing/2016/ink" xmlns:am3d="http://schemas.microsoft.com/office/drawing/2017/model3d" xmlns:o="urn:schemas-microsoft-com:office:office" xmlns:oel="http://schemas.microsoft.com/office/2019/extlst" xmlns:r="http://schemas.openxmlformats.org/officeDocument/2006/relationships" xmlns:m="http://schemas.openxmlformats.org/officeDocument/2006/math" xmlns:v="urn:schemas-microsoft-com:vml" xmlns:wp14="http://schemas.microsoft.com/office/word/2010/wordprocessingDrawing" xmlns:wp="http://schemas.openxmlformats.org/drawingml/2006/wordprocessingDrawing" xmlns:w10="urn:schemas-microsoft-com:office:word" xmlns:w="http://schemas.openxmlformats.org/wordprocessingml/2006/main" xmlns:w14="http://schemas.microsoft.com/office/word/2010/wordml" xmlns:w15="http://schemas.microsoft.com/office/word/2012/wordml" xmlns:w16cex="http://schemas.microsoft.com/office/word/2018/wordml/cex" xmlns:w16cid="http://schemas.microsoft.com/office/word/2016/wordml/cid" xmlns:w16="http://schemas.microsoft.com/office/word/2018/wordml" xmlns:w16du="http://schemas.microsoft.com/office/word/2023/wordml/word16du" xmlns:w16sdtdh="http://schemas.microsoft.com/office/word/2020/wordml/sdtdatahash" xmlns:w16sdtfl="http://schemas.microsoft.com/office/word/2024/wordml/sdtformatlock" xmlns:w16se="http://schemas.microsoft.com/office/word/2015/wordml/symex" xmlns:wpg="http://schemas.microsoft.com/office/word/2010/wordprocessingGroup" xmlns:wpi="http://schemas.microsoft.com/office/word/2010/wordprocessingInk" xmlns:wne="http://schemas.microsoft.com/office/word/2006/wordml" xmlns:wps="http://schemas.microsoft.com/office/word/2010/wordprocessingShape" mc:Ignorable="w14 w15 w16se w16cid w16 w16cex w16sdtdh w16sdtfl w16du wp14">
   <w:body>
     <w:p>
       <w:pPr>
@@ -241,7 +241,7 @@
                         </a:ln>
                         <a:extLst>
                           <a:ext uri="{909E8E84-426E-40dd-AFC4-6F175D3DCCD1}">
-                            <a14:hiddenFill xmlns:a14="http://schemas.microsoft.com/office/drawing/2010/main" xmlns:w="http://schemas.openxmlformats.org/wordprocessingml/2006/main" xmlns:w10="urn:schemas-microsoft-com:office:word" xmlns:v="urn:schemas-microsoft-com:vml" xmlns:o="urn:schemas-microsoft-com:office:office" xmlns:mv="urn:schemas-microsoft-com:mac:vml" xmlns:mo="http://schemas.microsoft.com/office/mac/office/2008/main" xmlns="" xmlns:w16sdtfl="http://schemas.microsoft.com/office/word/2024/wordml/sdtformatlock">
+                            <a14:hiddenFill xmlns="" xmlns:mo="http://schemas.microsoft.com/office/mac/office/2008/main" xmlns:mv="urn:schemas-microsoft-com:mac:vml" xmlns:o="urn:schemas-microsoft-com:office:office" xmlns:v="urn:schemas-microsoft-com:vml" xmlns:w10="urn:schemas-microsoft-com:office:word" xmlns:w="http://schemas.openxmlformats.org/wordprocessingml/2006/main" xmlns:a14="http://schemas.microsoft.com/office/drawing/2010/main">
                               <a:noFill/>
                             </a14:hiddenFill>
                           </a:ext>
@@ -551,15 +551,7 @@
                 <w:sz w:val="32"/>
                 <w:szCs w:val="32"/>
               </w:rPr>
-              <w:t>Análisis de Datos: Dinámicas de la Economía y Comportamiento del Desempleo en el Ecuador (Periodo 2026</w:t>
-            </w:r>
-            <w:r>
-              <w:rPr>
-                <w:b/>
-                <w:sz w:val="32"/>
-                <w:szCs w:val="32"/>
-              </w:rPr>
-              <w:t>)</w:t>
+              <w:t>Análisis de Datos: Dinámicas de la Economía y Comportamiento del Desempleo en el Ecuador (Periodo 2026)</w:t>
             </w:r>
           </w:p>
         </w:tc>
@@ -600,6 +592,9 @@
               <w:ind w:left="1880"/>
               <w:jc w:val="center"/>
             </w:pPr>
+            <w:r>
+              <w:t>Joshua Llumiquinga</w:t>
+            </w:r>
           </w:p>
           <w:p>
             <w:pPr>
@@ -1024,9 +1019,593 @@
     </w:p>
     <w:p>
       <w:pPr>
+        <w:pStyle w:val="Prrafodelista"/>
+        <w:numPr>
+          <w:ilvl w:val="0"/>
+          <w:numId w:val="27"/>
+        </w:numPr>
         <w:spacing w:after="240"/>
         <w:rPr>
           <w:b/>
+        </w:rPr>
+      </w:pPr>
+      <w:r>
+        <w:rPr>
+          <w:bCs/>
+        </w:rPr>
+        <w:t>ETL: el siguiente procedimiento ETL realizado en KNIME fue el siguiente</w:t>
+      </w:r>
+      <w:r>
+        <w:rPr>
+          <w:bCs/>
+        </w:rPr>
+        <w:t xml:space="preserve"> </w:t>
+      </w:r>
+    </w:p>
+    <w:p>
+      <w:pPr>
+        <w:pStyle w:val="Prrafodelista"/>
+        <w:numPr>
+          <w:ilvl w:val="1"/>
+          <w:numId w:val="26"/>
+        </w:numPr>
+        <w:spacing w:after="240"/>
+        <w:rPr>
+          <w:b/>
+        </w:rPr>
+      </w:pPr>
+      <w:r>
+        <w:rPr>
+          <w:bCs/>
+        </w:rPr>
+        <w:t>Fase de extracción: se saca datos de fuentes verificables de la pagina oficial MINISTERIO DEL ECUADOR los siguientes archivos:</w:t>
+      </w:r>
+    </w:p>
+    <w:p>
+      <w:pPr>
+        <w:pStyle w:val="Prrafodelista"/>
+        <w:spacing w:after="240"/>
+        <w:ind w:left="1440"/>
+        <w:rPr>
+          <w:bCs/>
+        </w:rPr>
+      </w:pPr>
+    </w:p>
+    <w:p>
+      <w:pPr>
+        <w:pStyle w:val="Prrafodelista"/>
+        <w:spacing w:after="240"/>
+        <w:ind w:left="1440"/>
+        <w:rPr>
+          <w:bCs/>
+        </w:rPr>
+      </w:pPr>
+      <w:proofErr w:type="spellStart"/>
+      <w:r>
+        <w:rPr>
+          <w:bCs/>
+        </w:rPr>
+        <w:t>Ieps_proyecto</w:t>
+      </w:r>
+      <w:proofErr w:type="spellEnd"/>
+      <w:r>
+        <w:rPr>
+          <w:bCs/>
+        </w:rPr>
+        <w:t xml:space="preserve"> inversión.</w:t>
+      </w:r>
+    </w:p>
+    <w:p>
+      <w:pPr>
+        <w:pStyle w:val="Prrafodelista"/>
+        <w:spacing w:after="240"/>
+        <w:ind w:left="1440"/>
+        <w:rPr>
+          <w:bCs/>
+        </w:rPr>
+      </w:pPr>
+      <w:r>
+        <w:rPr>
+          <w:bCs/>
+        </w:rPr>
+        <w:t>Base de datos proyecto de economías comunitarias, fuente economía desempleo,</w:t>
+      </w:r>
+    </w:p>
+    <w:p>
+      <w:pPr>
+        <w:pStyle w:val="Prrafodelista"/>
+        <w:spacing w:after="240"/>
+        <w:ind w:left="1440"/>
+        <w:rPr>
+          <w:bCs/>
+        </w:rPr>
+      </w:pPr>
+      <w:proofErr w:type="spellStart"/>
+      <w:r>
+        <w:rPr>
+          <w:bCs/>
+        </w:rPr>
+        <w:lastRenderedPageBreak/>
+        <w:t>Inec</w:t>
+      </w:r>
+      <w:proofErr w:type="spellEnd"/>
+      <w:r>
+        <w:rPr>
+          <w:bCs/>
+        </w:rPr>
+        <w:t xml:space="preserve"> </w:t>
+      </w:r>
+      <w:proofErr w:type="spellStart"/>
+      <w:r>
+        <w:rPr>
+          <w:bCs/>
+        </w:rPr>
+        <w:t>enemdu</w:t>
+      </w:r>
+      <w:proofErr w:type="spellEnd"/>
+      <w:r>
+        <w:rPr>
+          <w:bCs/>
+        </w:rPr>
+        <w:t xml:space="preserve"> consumido, mies bonos pensiones,</w:t>
+      </w:r>
+    </w:p>
+    <w:p>
+      <w:pPr>
+        <w:pStyle w:val="Prrafodelista"/>
+        <w:spacing w:after="240"/>
+        <w:ind w:left="1440"/>
+        <w:rPr>
+          <w:bCs/>
+        </w:rPr>
+      </w:pPr>
+      <w:r>
+        <w:rPr>
+          <w:bCs/>
+        </w:rPr>
+        <w:t>Personas rs18</w:t>
+      </w:r>
+    </w:p>
+    <w:p>
+      <w:pPr>
+        <w:pStyle w:val="Prrafodelista"/>
+        <w:spacing w:after="240"/>
+        <w:ind w:left="1440"/>
+        <w:rPr>
+          <w:bCs/>
+        </w:rPr>
+      </w:pPr>
+      <w:proofErr w:type="spellStart"/>
+      <w:r>
+        <w:rPr>
+          <w:bCs/>
+        </w:rPr>
+        <w:t>Esporte</w:t>
+      </w:r>
+      <w:proofErr w:type="spellEnd"/>
+      <w:r>
+        <w:rPr>
+          <w:bCs/>
+        </w:rPr>
+        <w:t xml:space="preserve"> estadístico mayo</w:t>
+      </w:r>
+    </w:p>
+    <w:p>
+      <w:pPr>
+        <w:pStyle w:val="Prrafodelista"/>
+        <w:spacing w:after="240"/>
+        <w:ind w:left="1440"/>
+        <w:rPr>
+          <w:bCs/>
+        </w:rPr>
+      </w:pPr>
+      <w:r>
+        <w:rPr>
+          <w:bCs/>
+        </w:rPr>
+        <w:t xml:space="preserve">Urs personas </w:t>
+      </w:r>
+      <w:proofErr w:type="spellStart"/>
+      <w:r>
+        <w:rPr>
+          <w:bCs/>
+        </w:rPr>
+        <w:t>dd</w:t>
+      </w:r>
+      <w:proofErr w:type="spellEnd"/>
+      <w:r>
+        <w:rPr>
+          <w:bCs/>
+        </w:rPr>
+        <w:t xml:space="preserve"> 2024</w:t>
+      </w:r>
+    </w:p>
+    <w:p>
+      <w:pPr>
+        <w:pStyle w:val="Prrafodelista"/>
+        <w:numPr>
+          <w:ilvl w:val="1"/>
+          <w:numId w:val="26"/>
+        </w:numPr>
+        <w:spacing w:after="240"/>
+        <w:rPr>
+          <w:b/>
+        </w:rPr>
+      </w:pPr>
+      <w:r>
+        <w:rPr>
+          <w:b/>
+        </w:rPr>
+        <w:t xml:space="preserve">Fase </w:t>
+      </w:r>
+      <w:proofErr w:type="spellStart"/>
+      <w:r>
+        <w:rPr>
+          <w:b/>
+        </w:rPr>
+        <w:t>Transformacion</w:t>
+      </w:r>
+      <w:proofErr w:type="spellEnd"/>
+      <w:r>
+        <w:rPr>
+          <w:b/>
+        </w:rPr>
+        <w:t xml:space="preserve">: </w:t>
+      </w:r>
+    </w:p>
+    <w:p>
+      <w:pPr>
+        <w:pStyle w:val="Prrafodelista"/>
+        <w:spacing w:after="240"/>
+        <w:ind w:left="1440"/>
+        <w:rPr>
+          <w:bCs/>
+        </w:rPr>
+      </w:pPr>
+      <w:r>
+        <w:rPr>
+          <w:bCs/>
+        </w:rPr>
+        <w:t xml:space="preserve">Se utiliza nodos JSON Path, </w:t>
+      </w:r>
+      <w:proofErr w:type="spellStart"/>
+      <w:r>
+        <w:rPr>
+          <w:bCs/>
+        </w:rPr>
+        <w:t>Ungroup</w:t>
+      </w:r>
+      <w:proofErr w:type="spellEnd"/>
+      <w:r>
+        <w:rPr>
+          <w:bCs/>
+        </w:rPr>
+        <w:t xml:space="preserve">, JSON table para extraer datos JSON también el sacar datos tipo CVS, Excel, </w:t>
+      </w:r>
+      <w:proofErr w:type="spellStart"/>
+      <w:r>
+        <w:rPr>
+          <w:bCs/>
+        </w:rPr>
+        <w:t>sqlite</w:t>
+      </w:r>
+      <w:proofErr w:type="spellEnd"/>
+      <w:r>
+        <w:rPr>
+          <w:bCs/>
+        </w:rPr>
+        <w:t xml:space="preserve"> con nodos para lectura para revisión de los datos requeridos.</w:t>
+      </w:r>
+      <w:r>
+        <w:rPr>
+          <w:bCs/>
+        </w:rPr>
+        <w:t xml:space="preserve"> Los datos creados a partir de scripts del programa </w:t>
+      </w:r>
+      <w:proofErr w:type="spellStart"/>
+      <w:r>
+        <w:rPr>
+          <w:bCs/>
+        </w:rPr>
+        <w:t>jupyter</w:t>
+      </w:r>
+      <w:proofErr w:type="spellEnd"/>
+      <w:r>
+        <w:rPr>
+          <w:bCs/>
+        </w:rPr>
+        <w:t xml:space="preserve"> notebook.</w:t>
+      </w:r>
+    </w:p>
+    <w:p>
+      <w:pPr>
+        <w:pStyle w:val="Prrafodelista"/>
+        <w:numPr>
+          <w:ilvl w:val="1"/>
+          <w:numId w:val="26"/>
+        </w:numPr>
+        <w:spacing w:after="240"/>
+        <w:rPr>
+          <w:bCs/>
+        </w:rPr>
+      </w:pPr>
+      <w:r>
+        <w:rPr>
+          <w:bCs/>
+        </w:rPr>
+        <w:t xml:space="preserve">Limpieza y reducción de dimensiones: Se normaliza las tablas utilizando nodos como </w:t>
+      </w:r>
+      <w:proofErr w:type="spellStart"/>
+      <w:r>
+        <w:rPr>
+          <w:bCs/>
+        </w:rPr>
+        <w:t>Column</w:t>
+      </w:r>
+      <w:proofErr w:type="spellEnd"/>
+      <w:r>
+        <w:rPr>
+          <w:bCs/>
+        </w:rPr>
+        <w:t xml:space="preserve"> Filter, Row Filter, Row Splitter esto para eliminar columnas redundantes e </w:t>
+      </w:r>
+      <w:r>
+        <w:rPr>
+          <w:bCs/>
+        </w:rPr>
+        <w:t>innecesarias</w:t>
+      </w:r>
+      <w:r>
+        <w:rPr>
+          <w:bCs/>
+        </w:rPr>
+        <w:t xml:space="preserve"> para la optimización de la lectura al momento de la revisión de sus datos, al igual que como se puede ver en el KNIME se utilizo 3 </w:t>
+      </w:r>
+      <w:proofErr w:type="spellStart"/>
+      <w:r>
+        <w:rPr>
+          <w:bCs/>
+        </w:rPr>
+        <w:t>row</w:t>
+      </w:r>
+      <w:proofErr w:type="spellEnd"/>
+      <w:r>
+        <w:rPr>
+          <w:bCs/>
+        </w:rPr>
+        <w:t xml:space="preserve"> </w:t>
+      </w:r>
+      <w:proofErr w:type="spellStart"/>
+      <w:r>
+        <w:rPr>
+          <w:bCs/>
+        </w:rPr>
+        <w:t>splitter</w:t>
+      </w:r>
+      <w:proofErr w:type="spellEnd"/>
+      <w:r>
+        <w:rPr>
+          <w:bCs/>
+        </w:rPr>
+        <w:t xml:space="preserve"> para la división de tablas que se encontraban en su momento unidas.</w:t>
+      </w:r>
+    </w:p>
+    <w:p>
+      <w:pPr>
+        <w:pStyle w:val="Prrafodelista"/>
+        <w:numPr>
+          <w:ilvl w:val="1"/>
+          <w:numId w:val="26"/>
+        </w:numPr>
+        <w:spacing w:after="240"/>
+        <w:rPr>
+          <w:bCs/>
+        </w:rPr>
+      </w:pPr>
+      <w:r>
+        <w:rPr>
+          <w:bCs/>
+        </w:rPr>
+        <w:t xml:space="preserve">Estandarización y Formateo de datos: </w:t>
+      </w:r>
+      <w:r>
+        <w:rPr>
+          <w:bCs/>
+        </w:rPr>
+        <w:t>En este lado empezamos a renombrar atributos, también eliminar datos nulos, convertir los datos a sus respectivos tipo de datos (</w:t>
+      </w:r>
+      <w:proofErr w:type="spellStart"/>
+      <w:r>
+        <w:rPr>
+          <w:bCs/>
+        </w:rPr>
+        <w:t>int</w:t>
+      </w:r>
+      <w:proofErr w:type="spellEnd"/>
+      <w:r>
+        <w:rPr>
+          <w:bCs/>
+        </w:rPr>
+        <w:t xml:space="preserve">, </w:t>
+      </w:r>
+      <w:proofErr w:type="spellStart"/>
+      <w:r>
+        <w:rPr>
+          <w:bCs/>
+        </w:rPr>
+        <w:t>float</w:t>
+      </w:r>
+      <w:proofErr w:type="spellEnd"/>
+      <w:r>
+        <w:rPr>
+          <w:bCs/>
+        </w:rPr>
+        <w:t xml:space="preserve">, </w:t>
+      </w:r>
+      <w:proofErr w:type="spellStart"/>
+      <w:r>
+        <w:rPr>
+          <w:bCs/>
+        </w:rPr>
+        <w:t>string</w:t>
+      </w:r>
+      <w:proofErr w:type="spellEnd"/>
+      <w:r>
+        <w:rPr>
+          <w:bCs/>
+        </w:rPr>
+        <w:t xml:space="preserve">, date) en este utilizamos los nodos </w:t>
+      </w:r>
+      <w:proofErr w:type="spellStart"/>
+      <w:r>
+        <w:rPr>
+          <w:bCs/>
+        </w:rPr>
+        <w:t>Column</w:t>
+      </w:r>
+      <w:proofErr w:type="spellEnd"/>
+      <w:r>
+        <w:rPr>
+          <w:bCs/>
+        </w:rPr>
+        <w:t xml:space="preserve"> </w:t>
+      </w:r>
+      <w:proofErr w:type="spellStart"/>
+      <w:r>
+        <w:rPr>
+          <w:bCs/>
+        </w:rPr>
+        <w:t>Rename</w:t>
+      </w:r>
+      <w:proofErr w:type="spellEnd"/>
+      <w:r>
+        <w:rPr>
+          <w:bCs/>
+        </w:rPr>
+        <w:t xml:space="preserve">, String </w:t>
+      </w:r>
+      <w:proofErr w:type="spellStart"/>
+      <w:r>
+        <w:rPr>
+          <w:bCs/>
+        </w:rPr>
+        <w:t>to</w:t>
+      </w:r>
+      <w:proofErr w:type="spellEnd"/>
+      <w:r>
+        <w:rPr>
+          <w:bCs/>
+        </w:rPr>
+        <w:t xml:space="preserve"> Date</w:t>
+      </w:r>
+      <w:r>
+        <w:rPr>
+          <w:bCs/>
+          <w:lang w:val="es-EC"/>
+        </w:rPr>
+        <w:t xml:space="preserve">&amp;Time </w:t>
+      </w:r>
+    </w:p>
+    <w:p>
+      <w:pPr>
+        <w:pStyle w:val="Prrafodelista"/>
+        <w:numPr>
+          <w:ilvl w:val="1"/>
+          <w:numId w:val="26"/>
+        </w:numPr>
+        <w:spacing w:after="240"/>
+        <w:rPr>
+          <w:bCs/>
+        </w:rPr>
+      </w:pPr>
+      <w:r>
+        <w:rPr>
+          <w:bCs/>
+          <w:lang w:val="es-EC"/>
+        </w:rPr>
+        <w:t xml:space="preserve">Integración de Conjuntos de Datos: Se unen todos los datos con el nodo </w:t>
+      </w:r>
+      <w:proofErr w:type="spellStart"/>
+      <w:r>
+        <w:rPr>
+          <w:bCs/>
+          <w:lang w:val="es-EC"/>
+        </w:rPr>
+        <w:t>concatenate</w:t>
+      </w:r>
+      <w:proofErr w:type="spellEnd"/>
+      <w:r>
+        <w:rPr>
+          <w:bCs/>
+          <w:lang w:val="es-EC"/>
+        </w:rPr>
+        <w:t xml:space="preserve"> esto para unificar registros en una sola tabla.</w:t>
+      </w:r>
+    </w:p>
+    <w:p>
+      <w:pPr>
+        <w:pStyle w:val="Prrafodelista"/>
+        <w:numPr>
+          <w:ilvl w:val="1"/>
+          <w:numId w:val="26"/>
+        </w:numPr>
+        <w:spacing w:after="240"/>
+        <w:rPr>
+          <w:bCs/>
+        </w:rPr>
+      </w:pPr>
+      <w:r>
+        <w:rPr>
+          <w:bCs/>
+          <w:lang w:val="es-EC"/>
+        </w:rPr>
+        <w:t xml:space="preserve">Fase de carga: Se convierte los datos que fueron transformados y validados en CVS con los nodos </w:t>
+      </w:r>
+      <w:proofErr w:type="spellStart"/>
+      <w:r>
+        <w:rPr>
+          <w:bCs/>
+          <w:lang w:val="es-EC"/>
+        </w:rPr>
+        <w:t>write</w:t>
+      </w:r>
+      <w:proofErr w:type="spellEnd"/>
+      <w:r>
+        <w:rPr>
+          <w:bCs/>
+          <w:lang w:val="es-EC"/>
+        </w:rPr>
+        <w:t xml:space="preserve"> CVS esto debido al requerimiento del proyecto</w:t>
+      </w:r>
+      <w:r>
+        <w:rPr>
+          <w:bCs/>
+          <w:lang w:val="es-EC"/>
+        </w:rPr>
+        <w:t>.</w:t>
+      </w:r>
+    </w:p>
+    <w:p>
+      <w:pPr>
+        <w:spacing w:after="240"/>
+        <w:rPr>
+          <w:bCs/>
+        </w:rPr>
+      </w:pPr>
+      <w:r>
+        <w:rPr>
+          <w:bCs/>
+        </w:rPr>
+        <w:t>Nota: Se toma en cuenta que todos los datos son sacados en cuestión de Ecuador como taza de pobreza, taza de proyectos realizados, etc. Los que se armaron como tipo estrella en función a que todos son datos centrados en Ecuador</w:t>
+      </w:r>
+    </w:p>
+    <w:p>
+      <w:pPr>
+        <w:pStyle w:val="Prrafodelista"/>
+        <w:spacing w:after="240"/>
+        <w:ind w:left="1440"/>
+        <w:rPr>
+          <w:bCs/>
         </w:rPr>
       </w:pPr>
     </w:p>
@@ -1043,7 +1622,7 @@
 </file>
 
 <file path=word/endnotes.xml><?xml version="1.0" encoding="utf-8"?>
-<w:endnotes xmlns:wpc="http://schemas.microsoft.com/office/word/2010/wordprocessingCanvas" xmlns:cx="http://schemas.microsoft.com/office/drawing/2014/chartex" xmlns:cx1="http://schemas.microsoft.com/office/drawing/2015/9/8/chartex" xmlns:cx2="http://schemas.microsoft.com/office/drawing/2015/10/21/chartex" xmlns:cx3="http://schemas.microsoft.com/office/drawing/2016/5/9/chartex" xmlns:cx4="http://schemas.microsoft.com/office/drawing/2016/5/10/chartex" xmlns:cx5="http://schemas.microsoft.com/office/drawing/2016/5/11/chartex" xmlns:cx6="http://schemas.microsoft.com/office/drawing/2016/5/12/chartex" xmlns:cx7="http://schemas.microsoft.com/office/drawing/2016/5/13/chartex" xmlns:cx8="http://schemas.microsoft.com/office/drawing/2016/5/14/chartex" xmlns:mc="http://schemas.openxmlformats.org/markup-compatibility/2006" xmlns:aink="http://schemas.microsoft.com/office/drawing/2016/ink" xmlns:am3d="http://schemas.microsoft.com/office/drawing/2017/model3d" xmlns:o="urn:schemas-microsoft-com:office:office" xmlns:oel="http://schemas.microsoft.com/office/2019/extlst" xmlns:r="http://schemas.openxmlformats.org/officeDocument/2006/relationships" xmlns:m="http://schemas.openxmlformats.org/officeDocument/2006/math" xmlns:v="urn:schemas-microsoft-com:vml" xmlns:wp14="http://schemas.microsoft.com/office/word/2010/wordprocessingDrawing" xmlns:wp="http://schemas.openxmlformats.org/drawingml/2006/wordprocessingDrawing" xmlns:w10="urn:schemas-microsoft-com:office:word" xmlns:w="http://schemas.openxmlformats.org/wordprocessingml/2006/main" xmlns:w14="http://schemas.microsoft.com/office/word/2010/wordml" xmlns:w15="http://schemas.microsoft.com/office/word/2012/wordml" xmlns:w16cex="http://schemas.microsoft.com/office/word/2018/wordml/cex" xmlns:w16cid="http://schemas.microsoft.com/office/word/2016/wordml/cid" xmlns:w16="http://schemas.microsoft.com/office/word/2018/wordml" xmlns:w16sdtdh="http://schemas.microsoft.com/office/word/2020/wordml/sdtdatahash" xmlns:w16se="http://schemas.microsoft.com/office/word/2015/wordml/symex" xmlns:wpg="http://schemas.microsoft.com/office/word/2010/wordprocessingGroup" xmlns:wpi="http://schemas.microsoft.com/office/word/2010/wordprocessingInk" xmlns:wne="http://schemas.microsoft.com/office/word/2006/wordml" xmlns:wps="http://schemas.microsoft.com/office/word/2010/wordprocessingShape" mc:Ignorable="w14 w15 w16se w16cid w16 w16cex w16sdtdh wp14">
+<w:endnotes xmlns:wpc="http://schemas.microsoft.com/office/word/2010/wordprocessingCanvas" xmlns:cx="http://schemas.microsoft.com/office/drawing/2014/chartex" xmlns:cx1="http://schemas.microsoft.com/office/drawing/2015/9/8/chartex" xmlns:cx2="http://schemas.microsoft.com/office/drawing/2015/10/21/chartex" xmlns:cx3="http://schemas.microsoft.com/office/drawing/2016/5/9/chartex" xmlns:cx4="http://schemas.microsoft.com/office/drawing/2016/5/10/chartex" xmlns:cx5="http://schemas.microsoft.com/office/drawing/2016/5/11/chartex" xmlns:cx6="http://schemas.microsoft.com/office/drawing/2016/5/12/chartex" xmlns:cx7="http://schemas.microsoft.com/office/drawing/2016/5/13/chartex" xmlns:cx8="http://schemas.microsoft.com/office/drawing/2016/5/14/chartex" xmlns:mc="http://schemas.openxmlformats.org/markup-compatibility/2006" xmlns:aink="http://schemas.microsoft.com/office/drawing/2016/ink" xmlns:am3d="http://schemas.microsoft.com/office/drawing/2017/model3d" xmlns:o="urn:schemas-microsoft-com:office:office" xmlns:oel="http://schemas.microsoft.com/office/2019/extlst" xmlns:r="http://schemas.openxmlformats.org/officeDocument/2006/relationships" xmlns:m="http://schemas.openxmlformats.org/officeDocument/2006/math" xmlns:v="urn:schemas-microsoft-com:vml" xmlns:wp14="http://schemas.microsoft.com/office/word/2010/wordprocessingDrawing" xmlns:wp="http://schemas.openxmlformats.org/drawingml/2006/wordprocessingDrawing" xmlns:w10="urn:schemas-microsoft-com:office:word" xmlns:w="http://schemas.openxmlformats.org/wordprocessingml/2006/main" xmlns:w14="http://schemas.microsoft.com/office/word/2010/wordml" xmlns:w15="http://schemas.microsoft.com/office/word/2012/wordml" xmlns:w16cex="http://schemas.microsoft.com/office/word/2018/wordml/cex" xmlns:w16cid="http://schemas.microsoft.com/office/word/2016/wordml/cid" xmlns:w16="http://schemas.microsoft.com/office/word/2018/wordml" xmlns:w16du="http://schemas.microsoft.com/office/word/2023/wordml/word16du" xmlns:w16sdtdh="http://schemas.microsoft.com/office/word/2020/wordml/sdtdatahash" xmlns:w16sdtfl="http://schemas.microsoft.com/office/word/2024/wordml/sdtformatlock" xmlns:w16se="http://schemas.microsoft.com/office/word/2015/wordml/symex" xmlns:wpg="http://schemas.microsoft.com/office/word/2010/wordprocessingGroup" xmlns:wpi="http://schemas.microsoft.com/office/word/2010/wordprocessingInk" xmlns:wne="http://schemas.microsoft.com/office/word/2006/wordml" xmlns:wps="http://schemas.microsoft.com/office/word/2010/wordprocessingShape" mc:Ignorable="w14 w15 w16se w16cid w16 w16cex w16sdtdh w16sdtfl w16du wp14">
   <w:endnote w:type="separator" w:id="-1">
     <w:p>
       <w:r>
@@ -1062,7 +1641,7 @@
 </file>
 
 <file path=word/footer1.xml><?xml version="1.0" encoding="utf-8"?>
-<w:ftr xmlns:wpc="http://schemas.microsoft.com/office/word/2010/wordprocessingCanvas" xmlns:cx="http://schemas.microsoft.com/office/drawing/2014/chartex" xmlns:cx1="http://schemas.microsoft.com/office/drawing/2015/9/8/chartex" xmlns:cx2="http://schemas.microsoft.com/office/drawing/2015/10/21/chartex" xmlns:cx3="http://schemas.microsoft.com/office/drawing/2016/5/9/chartex" xmlns:cx4="http://schemas.microsoft.com/office/drawing/2016/5/10/chartex" xmlns:cx5="http://schemas.microsoft.com/office/drawing/2016/5/11/chartex" xmlns:cx6="http://schemas.microsoft.com/office/drawing/2016/5/12/chartex" xmlns:cx7="http://schemas.microsoft.com/office/drawing/2016/5/13/chartex" xmlns:cx8="http://schemas.microsoft.com/office/drawing/2016/5/14/chartex" xmlns:mc="http://schemas.openxmlformats.org/markup-compatibility/2006" xmlns:aink="http://schemas.microsoft.com/office/drawing/2016/ink" xmlns:am3d="http://schemas.microsoft.com/office/drawing/2017/model3d" xmlns:o="urn:schemas-microsoft-com:office:office" xmlns:oel="http://schemas.microsoft.com/office/2019/extlst" xmlns:r="http://schemas.openxmlformats.org/officeDocument/2006/relationships" xmlns:m="http://schemas.openxmlformats.org/officeDocument/2006/math" xmlns:v="urn:schemas-microsoft-com:vml" xmlns:wp14="http://schemas.microsoft.com/office/word/2010/wordprocessingDrawing" xmlns:wp="http://schemas.openxmlformats.org/drawingml/2006/wordprocessingDrawing" xmlns:w10="urn:schemas-microsoft-com:office:word" xmlns:w="http://schemas.openxmlformats.org/wordprocessingml/2006/main" xmlns:w14="http://schemas.microsoft.com/office/word/2010/wordml" xmlns:w15="http://schemas.microsoft.com/office/word/2012/wordml" xmlns:w16cex="http://schemas.microsoft.com/office/word/2018/wordml/cex" xmlns:w16cid="http://schemas.microsoft.com/office/word/2016/wordml/cid" xmlns:w16="http://schemas.microsoft.com/office/word/2018/wordml" xmlns:w16sdtdh="http://schemas.microsoft.com/office/word/2020/wordml/sdtdatahash" xmlns:w16se="http://schemas.microsoft.com/office/word/2015/wordml/symex" xmlns:wpg="http://schemas.microsoft.com/office/word/2010/wordprocessingGroup" xmlns:wpi="http://schemas.microsoft.com/office/word/2010/wordprocessingInk" xmlns:wne="http://schemas.microsoft.com/office/word/2006/wordml" xmlns:wps="http://schemas.microsoft.com/office/word/2010/wordprocessingShape" mc:Ignorable="w14 w15 w16se w16cid w16 w16cex w16sdtdh wp14">
+<w:ftr xmlns:wpc="http://schemas.microsoft.com/office/word/2010/wordprocessingCanvas" xmlns:cx="http://schemas.microsoft.com/office/drawing/2014/chartex" xmlns:cx1="http://schemas.microsoft.com/office/drawing/2015/9/8/chartex" xmlns:cx2="http://schemas.microsoft.com/office/drawing/2015/10/21/chartex" xmlns:cx3="http://schemas.microsoft.com/office/drawing/2016/5/9/chartex" xmlns:cx4="http://schemas.microsoft.com/office/drawing/2016/5/10/chartex" xmlns:cx5="http://schemas.microsoft.com/office/drawing/2016/5/11/chartex" xmlns:cx6="http://schemas.microsoft.com/office/drawing/2016/5/12/chartex" xmlns:cx7="http://schemas.microsoft.com/office/drawing/2016/5/13/chartex" xmlns:cx8="http://schemas.microsoft.com/office/drawing/2016/5/14/chartex" xmlns:mc="http://schemas.openxmlformats.org/markup-compatibility/2006" xmlns:aink="http://schemas.microsoft.com/office/drawing/2016/ink" xmlns:am3d="http://schemas.microsoft.com/office/drawing/2017/model3d" xmlns:o="urn:schemas-microsoft-com:office:office" xmlns:oel="http://schemas.microsoft.com/office/2019/extlst" xmlns:r="http://schemas.openxmlformats.org/officeDocument/2006/relationships" xmlns:m="http://schemas.openxmlformats.org/officeDocument/2006/math" xmlns:v="urn:schemas-microsoft-com:vml" xmlns:wp14="http://schemas.microsoft.com/office/word/2010/wordprocessingDrawing" xmlns:wp="http://schemas.openxmlformats.org/drawingml/2006/wordprocessingDrawing" xmlns:w10="urn:schemas-microsoft-com:office:word" xmlns:w="http://schemas.openxmlformats.org/wordprocessingml/2006/main" xmlns:w14="http://schemas.microsoft.com/office/word/2010/wordml" xmlns:w15="http://schemas.microsoft.com/office/word/2012/wordml" xmlns:w16cex="http://schemas.microsoft.com/office/word/2018/wordml/cex" xmlns:w16cid="http://schemas.microsoft.com/office/word/2016/wordml/cid" xmlns:w16="http://schemas.microsoft.com/office/word/2018/wordml" xmlns:w16du="http://schemas.microsoft.com/office/word/2023/wordml/word16du" xmlns:w16sdtdh="http://schemas.microsoft.com/office/word/2020/wordml/sdtdatahash" xmlns:w16sdtfl="http://schemas.microsoft.com/office/word/2024/wordml/sdtformatlock" xmlns:w16se="http://schemas.microsoft.com/office/word/2015/wordml/symex" xmlns:wpg="http://schemas.microsoft.com/office/word/2010/wordprocessingGroup" xmlns:wpi="http://schemas.microsoft.com/office/word/2010/wordprocessingInk" xmlns:wne="http://schemas.microsoft.com/office/word/2006/wordml" xmlns:wps="http://schemas.microsoft.com/office/word/2010/wordprocessingShape" mc:Ignorable="w14 w15 w16se w16cid w16 w16cex w16sdtdh w16sdtfl w16du wp14">
   <w:p>
     <w:pPr>
       <w:pStyle w:val="Piedepgina"/>
@@ -1161,7 +1740,7 @@
 </file>
 
 <file path=word/footnotes.xml><?xml version="1.0" encoding="utf-8"?>
-<w:footnotes xmlns:wpc="http://schemas.microsoft.com/office/word/2010/wordprocessingCanvas" xmlns:cx="http://schemas.microsoft.com/office/drawing/2014/chartex" xmlns:cx1="http://schemas.microsoft.com/office/drawing/2015/9/8/chartex" xmlns:cx2="http://schemas.microsoft.com/office/drawing/2015/10/21/chartex" xmlns:cx3="http://schemas.microsoft.com/office/drawing/2016/5/9/chartex" xmlns:cx4="http://schemas.microsoft.com/office/drawing/2016/5/10/chartex" xmlns:cx5="http://schemas.microsoft.com/office/drawing/2016/5/11/chartex" xmlns:cx6="http://schemas.microsoft.com/office/drawing/2016/5/12/chartex" xmlns:cx7="http://schemas.microsoft.com/office/drawing/2016/5/13/chartex" xmlns:cx8="http://schemas.microsoft.com/office/drawing/2016/5/14/chartex" xmlns:mc="http://schemas.openxmlformats.org/markup-compatibility/2006" xmlns:aink="http://schemas.microsoft.com/office/drawing/2016/ink" xmlns:am3d="http://schemas.microsoft.com/office/drawing/2017/model3d" xmlns:o="urn:schemas-microsoft-com:office:office" xmlns:oel="http://schemas.microsoft.com/office/2019/extlst" xmlns:r="http://schemas.openxmlformats.org/officeDocument/2006/relationships" xmlns:m="http://schemas.openxmlformats.org/officeDocument/2006/math" xmlns:v="urn:schemas-microsoft-com:vml" xmlns:wp14="http://schemas.microsoft.com/office/word/2010/wordprocessingDrawing" xmlns:wp="http://schemas.openxmlformats.org/drawingml/2006/wordprocessingDrawing" xmlns:w10="urn:schemas-microsoft-com:office:word" xmlns:w="http://schemas.openxmlformats.org/wordprocessingml/2006/main" xmlns:w14="http://schemas.microsoft.com/office/word/2010/wordml" xmlns:w15="http://schemas.microsoft.com/office/word/2012/wordml" xmlns:w16cex="http://schemas.microsoft.com/office/word/2018/wordml/cex" xmlns:w16cid="http://schemas.microsoft.com/office/word/2016/wordml/cid" xmlns:w16="http://schemas.microsoft.com/office/word/2018/wordml" xmlns:w16sdtdh="http://schemas.microsoft.com/office/word/2020/wordml/sdtdatahash" xmlns:w16se="http://schemas.microsoft.com/office/word/2015/wordml/symex" xmlns:wpg="http://schemas.microsoft.com/office/word/2010/wordprocessingGroup" xmlns:wpi="http://schemas.microsoft.com/office/word/2010/wordprocessingInk" xmlns:wne="http://schemas.microsoft.com/office/word/2006/wordml" xmlns:wps="http://schemas.microsoft.com/office/word/2010/wordprocessingShape" mc:Ignorable="w14 w15 w16se w16cid w16 w16cex w16sdtdh wp14">
+<w:footnotes xmlns:wpc="http://schemas.microsoft.com/office/word/2010/wordprocessingCanvas" xmlns:cx="http://schemas.microsoft.com/office/drawing/2014/chartex" xmlns:cx1="http://schemas.microsoft.com/office/drawing/2015/9/8/chartex" xmlns:cx2="http://schemas.microsoft.com/office/drawing/2015/10/21/chartex" xmlns:cx3="http://schemas.microsoft.com/office/drawing/2016/5/9/chartex" xmlns:cx4="http://schemas.microsoft.com/office/drawing/2016/5/10/chartex" xmlns:cx5="http://schemas.microsoft.com/office/drawing/2016/5/11/chartex" xmlns:cx6="http://schemas.microsoft.com/office/drawing/2016/5/12/chartex" xmlns:cx7="http://schemas.microsoft.com/office/drawing/2016/5/13/chartex" xmlns:cx8="http://schemas.microsoft.com/office/drawing/2016/5/14/chartex" xmlns:mc="http://schemas.openxmlformats.org/markup-compatibility/2006" xmlns:aink="http://schemas.microsoft.com/office/drawing/2016/ink" xmlns:am3d="http://schemas.microsoft.com/office/drawing/2017/model3d" xmlns:o="urn:schemas-microsoft-com:office:office" xmlns:oel="http://schemas.microsoft.com/office/2019/extlst" xmlns:r="http://schemas.openxmlformats.org/officeDocument/2006/relationships" xmlns:m="http://schemas.openxmlformats.org/officeDocument/2006/math" xmlns:v="urn:schemas-microsoft-com:vml" xmlns:wp14="http://schemas.microsoft.com/office/word/2010/wordprocessingDrawing" xmlns:wp="http://schemas.openxmlformats.org/drawingml/2006/wordprocessingDrawing" xmlns:w10="urn:schemas-microsoft-com:office:word" xmlns:w="http://schemas.openxmlformats.org/wordprocessingml/2006/main" xmlns:w14="http://schemas.microsoft.com/office/word/2010/wordml" xmlns:w15="http://schemas.microsoft.com/office/word/2012/wordml" xmlns:w16cex="http://schemas.microsoft.com/office/word/2018/wordml/cex" xmlns:w16cid="http://schemas.microsoft.com/office/word/2016/wordml/cid" xmlns:w16="http://schemas.microsoft.com/office/word/2018/wordml" xmlns:w16du="http://schemas.microsoft.com/office/word/2023/wordml/word16du" xmlns:w16sdtdh="http://schemas.microsoft.com/office/word/2020/wordml/sdtdatahash" xmlns:w16sdtfl="http://schemas.microsoft.com/office/word/2024/wordml/sdtformatlock" xmlns:w16se="http://schemas.microsoft.com/office/word/2015/wordml/symex" xmlns:wpg="http://schemas.microsoft.com/office/word/2010/wordprocessingGroup" xmlns:wpi="http://schemas.microsoft.com/office/word/2010/wordprocessingInk" xmlns:wne="http://schemas.microsoft.com/office/word/2006/wordml" xmlns:wps="http://schemas.microsoft.com/office/word/2010/wordprocessingShape" mc:Ignorable="w14 w15 w16se w16cid w16 w16cex w16sdtdh w16sdtfl w16du wp14">
   <w:footnote w:type="separator" w:id="-1">
     <w:p>
       <w:r>
@@ -1180,7 +1759,7 @@
 </file>
 
 <file path=word/header1.xml><?xml version="1.0" encoding="utf-8"?>
-<w:hdr xmlns:wpc="http://schemas.microsoft.com/office/word/2010/wordprocessingCanvas" xmlns:cx="http://schemas.microsoft.com/office/drawing/2014/chartex" xmlns:cx1="http://schemas.microsoft.com/office/drawing/2015/9/8/chartex" xmlns:cx2="http://schemas.microsoft.com/office/drawing/2015/10/21/chartex" xmlns:cx3="http://schemas.microsoft.com/office/drawing/2016/5/9/chartex" xmlns:cx4="http://schemas.microsoft.com/office/drawing/2016/5/10/chartex" xmlns:cx5="http://schemas.microsoft.com/office/drawing/2016/5/11/chartex" xmlns:cx6="http://schemas.microsoft.com/office/drawing/2016/5/12/chartex" xmlns:cx7="http://schemas.microsoft.com/office/drawing/2016/5/13/chartex" xmlns:cx8="http://schemas.microsoft.com/office/drawing/2016/5/14/chartex" xmlns:mc="http://schemas.openxmlformats.org/markup-compatibility/2006" xmlns:aink="http://schemas.microsoft.com/office/drawing/2016/ink" xmlns:am3d="http://schemas.microsoft.com/office/drawing/2017/model3d" xmlns:o="urn:schemas-microsoft-com:office:office" xmlns:oel="http://schemas.microsoft.com/office/2019/extlst" xmlns:r="http://schemas.openxmlformats.org/officeDocument/2006/relationships" xmlns:m="http://schemas.openxmlformats.org/officeDocument/2006/math" xmlns:v="urn:schemas-microsoft-com:vml" xmlns:wp14="http://schemas.microsoft.com/office/word/2010/wordprocessingDrawing" xmlns:wp="http://schemas.openxmlformats.org/drawingml/2006/wordprocessingDrawing" xmlns:w10="urn:schemas-microsoft-com:office:word" xmlns:w="http://schemas.openxmlformats.org/wordprocessingml/2006/main" xmlns:w14="http://schemas.microsoft.com/office/word/2010/wordml" xmlns:w15="http://schemas.microsoft.com/office/word/2012/wordml" xmlns:w16cex="http://schemas.microsoft.com/office/word/2018/wordml/cex" xmlns:w16cid="http://schemas.microsoft.com/office/word/2016/wordml/cid" xmlns:w16="http://schemas.microsoft.com/office/word/2018/wordml" xmlns:w16sdtdh="http://schemas.microsoft.com/office/word/2020/wordml/sdtdatahash" xmlns:w16se="http://schemas.microsoft.com/office/word/2015/wordml/symex" xmlns:wpg="http://schemas.microsoft.com/office/word/2010/wordprocessingGroup" xmlns:wpi="http://schemas.microsoft.com/office/word/2010/wordprocessingInk" xmlns:wne="http://schemas.microsoft.com/office/word/2006/wordml" xmlns:wps="http://schemas.microsoft.com/office/word/2010/wordprocessingShape" mc:Ignorable="w14 w15 w16se w16cid w16 w16cex w16sdtdh wp14">
+<w:hdr xmlns:wpc="http://schemas.microsoft.com/office/word/2010/wordprocessingCanvas" xmlns:cx="http://schemas.microsoft.com/office/drawing/2014/chartex" xmlns:cx1="http://schemas.microsoft.com/office/drawing/2015/9/8/chartex" xmlns:cx2="http://schemas.microsoft.com/office/drawing/2015/10/21/chartex" xmlns:cx3="http://schemas.microsoft.com/office/drawing/2016/5/9/chartex" xmlns:cx4="http://schemas.microsoft.com/office/drawing/2016/5/10/chartex" xmlns:cx5="http://schemas.microsoft.com/office/drawing/2016/5/11/chartex" xmlns:cx6="http://schemas.microsoft.com/office/drawing/2016/5/12/chartex" xmlns:cx7="http://schemas.microsoft.com/office/drawing/2016/5/13/chartex" xmlns:cx8="http://schemas.microsoft.com/office/drawing/2016/5/14/chartex" xmlns:mc="http://schemas.openxmlformats.org/markup-compatibility/2006" xmlns:aink="http://schemas.microsoft.com/office/drawing/2016/ink" xmlns:am3d="http://schemas.microsoft.com/office/drawing/2017/model3d" xmlns:o="urn:schemas-microsoft-com:office:office" xmlns:oel="http://schemas.microsoft.com/office/2019/extlst" xmlns:r="http://schemas.openxmlformats.org/officeDocument/2006/relationships" xmlns:m="http://schemas.openxmlformats.org/officeDocument/2006/math" xmlns:v="urn:schemas-microsoft-com:vml" xmlns:wp14="http://schemas.microsoft.com/office/word/2010/wordprocessingDrawing" xmlns:wp="http://schemas.openxmlformats.org/drawingml/2006/wordprocessingDrawing" xmlns:w10="urn:schemas-microsoft-com:office:word" xmlns:w="http://schemas.openxmlformats.org/wordprocessingml/2006/main" xmlns:w14="http://schemas.microsoft.com/office/word/2010/wordml" xmlns:w15="http://schemas.microsoft.com/office/word/2012/wordml" xmlns:w16cex="http://schemas.microsoft.com/office/word/2018/wordml/cex" xmlns:w16cid="http://schemas.microsoft.com/office/word/2016/wordml/cid" xmlns:w16="http://schemas.microsoft.com/office/word/2018/wordml" xmlns:w16du="http://schemas.microsoft.com/office/word/2023/wordml/word16du" xmlns:w16sdtdh="http://schemas.microsoft.com/office/word/2020/wordml/sdtdatahash" xmlns:w16sdtfl="http://schemas.microsoft.com/office/word/2024/wordml/sdtformatlock" xmlns:w16se="http://schemas.microsoft.com/office/word/2015/wordml/symex" xmlns:wpg="http://schemas.microsoft.com/office/word/2010/wordprocessingGroup" xmlns:wpi="http://schemas.microsoft.com/office/word/2010/wordprocessingInk" xmlns:wne="http://schemas.microsoft.com/office/word/2006/wordml" xmlns:wps="http://schemas.microsoft.com/office/word/2010/wordprocessingShape" mc:Ignorable="w14 w15 w16se w16cid w16 w16cex w16sdtdh w16sdtfl w16du wp14">
   <w:p>
     <w:pPr>
       <w:pStyle w:val="Encabezado"/>
@@ -1236,7 +1815,7 @@
 </file>
 
 <file path=word/numbering.xml><?xml version="1.0" encoding="utf-8"?>
-<w:numbering xmlns:wpc="http://schemas.microsoft.com/office/word/2010/wordprocessingCanvas" xmlns:cx="http://schemas.microsoft.com/office/drawing/2014/chartex" xmlns:cx1="http://schemas.microsoft.com/office/drawing/2015/9/8/chartex" xmlns:cx2="http://schemas.microsoft.com/office/drawing/2015/10/21/chartex" xmlns:cx3="http://schemas.microsoft.com/office/drawing/2016/5/9/chartex" xmlns:cx4="http://schemas.microsoft.com/office/drawing/2016/5/10/chartex" xmlns:cx5="http://schemas.microsoft.com/office/drawing/2016/5/11/chartex" xmlns:cx6="http://schemas.microsoft.com/office/drawing/2016/5/12/chartex" xmlns:cx7="http://schemas.microsoft.com/office/drawing/2016/5/13/chartex" xmlns:cx8="http://schemas.microsoft.com/office/drawing/2016/5/14/chartex" xmlns:mc="http://schemas.openxmlformats.org/markup-compatibility/2006" xmlns:aink="http://schemas.microsoft.com/office/drawing/2016/ink" xmlns:am3d="http://schemas.microsoft.com/office/drawing/2017/model3d" xmlns:o="urn:schemas-microsoft-com:office:office" xmlns:oel="http://schemas.microsoft.com/office/2019/extlst" xmlns:r="http://schemas.openxmlformats.org/officeDocument/2006/relationships" xmlns:m="http://schemas.openxmlformats.org/officeDocument/2006/math" xmlns:v="urn:schemas-microsoft-com:vml" xmlns:wp14="http://schemas.microsoft.com/office/word/2010/wordprocessingDrawing" xmlns:wp="http://schemas.openxmlformats.org/drawingml/2006/wordprocessingDrawing" xmlns:w10="urn:schemas-microsoft-com:office:word" xmlns:w="http://schemas.openxmlformats.org/wordprocessingml/2006/main" xmlns:w14="http://schemas.microsoft.com/office/word/2010/wordml" xmlns:w15="http://schemas.microsoft.com/office/word/2012/wordml" xmlns:w16cex="http://schemas.microsoft.com/office/word/2018/wordml/cex" xmlns:w16cid="http://schemas.microsoft.com/office/word/2016/wordml/cid" xmlns:w16="http://schemas.microsoft.com/office/word/2018/wordml" xmlns:w16sdtdh="http://schemas.microsoft.com/office/word/2020/wordml/sdtdatahash" xmlns:w16se="http://schemas.microsoft.com/office/word/2015/wordml/symex" xmlns:wpg="http://schemas.microsoft.com/office/word/2010/wordprocessingGroup" xmlns:wpi="http://schemas.microsoft.com/office/word/2010/wordprocessingInk" xmlns:wne="http://schemas.microsoft.com/office/word/2006/wordml" xmlns:wps="http://schemas.microsoft.com/office/word/2010/wordprocessingShape" mc:Ignorable="w14 w15 w16se w16cid w16 w16cex w16sdtdh wp14">
+<w:numbering xmlns:wpc="http://schemas.microsoft.com/office/word/2010/wordprocessingCanvas" xmlns:cx="http://schemas.microsoft.com/office/drawing/2014/chartex" xmlns:cx1="http://schemas.microsoft.com/office/drawing/2015/9/8/chartex" xmlns:cx2="http://schemas.microsoft.com/office/drawing/2015/10/21/chartex" xmlns:cx3="http://schemas.microsoft.com/office/drawing/2016/5/9/chartex" xmlns:cx4="http://schemas.microsoft.com/office/drawing/2016/5/10/chartex" xmlns:cx5="http://schemas.microsoft.com/office/drawing/2016/5/11/chartex" xmlns:cx6="http://schemas.microsoft.com/office/drawing/2016/5/12/chartex" xmlns:cx7="http://schemas.microsoft.com/office/drawing/2016/5/13/chartex" xmlns:cx8="http://schemas.microsoft.com/office/drawing/2016/5/14/chartex" xmlns:mc="http://schemas.openxmlformats.org/markup-compatibility/2006" xmlns:aink="http://schemas.microsoft.com/office/drawing/2016/ink" xmlns:am3d="http://schemas.microsoft.com/office/drawing/2017/model3d" xmlns:o="urn:schemas-microsoft-com:office:office" xmlns:oel="http://schemas.microsoft.com/office/2019/extlst" xmlns:r="http://schemas.openxmlformats.org/officeDocument/2006/relationships" xmlns:m="http://schemas.openxmlformats.org/officeDocument/2006/math" xmlns:v="urn:schemas-microsoft-com:vml" xmlns:wp14="http://schemas.microsoft.com/office/word/2010/wordprocessingDrawing" xmlns:wp="http://schemas.openxmlformats.org/drawingml/2006/wordprocessingDrawing" xmlns:w10="urn:schemas-microsoft-com:office:word" xmlns:w="http://schemas.openxmlformats.org/wordprocessingml/2006/main" xmlns:w14="http://schemas.microsoft.com/office/word/2010/wordml" xmlns:w15="http://schemas.microsoft.com/office/word/2012/wordml" xmlns:w16cex="http://schemas.microsoft.com/office/word/2018/wordml/cex" xmlns:w16cid="http://schemas.microsoft.com/office/word/2016/wordml/cid" xmlns:w16="http://schemas.microsoft.com/office/word/2018/wordml" xmlns:w16du="http://schemas.microsoft.com/office/word/2023/wordml/word16du" xmlns:w16sdtdh="http://schemas.microsoft.com/office/word/2020/wordml/sdtdatahash" xmlns:w16sdtfl="http://schemas.microsoft.com/office/word/2024/wordml/sdtformatlock" xmlns:w16se="http://schemas.microsoft.com/office/word/2015/wordml/symex" xmlns:wpg="http://schemas.microsoft.com/office/word/2010/wordprocessingGroup" xmlns:wpi="http://schemas.microsoft.com/office/word/2010/wordprocessingInk" xmlns:wne="http://schemas.microsoft.com/office/word/2006/wordml" xmlns:wps="http://schemas.microsoft.com/office/word/2010/wordprocessingShape" mc:Ignorable="w14 w15 w16se w16cid w16 w16cex w16sdtdh w16sdtfl w16du wp14">
   <w:abstractNum w:abstractNumId="0" w15:restartNumberingAfterBreak="0">
     <w:nsid w:val="04920192"/>
     <w:multiLevelType w:val="hybridMultilevel"/>
@@ -1776,6 +2355,95 @@
     </w:lvl>
   </w:abstractNum>
   <w:abstractNum w:abstractNumId="5" w15:restartNumberingAfterBreak="0">
+    <w:nsid w:val="19370513"/>
+    <w:multiLevelType w:val="hybridMultilevel"/>
+    <w:tmpl w:val="9FDE9C4E"/>
+    <w:lvl w:ilvl="0" w:tplc="300A000F">
+      <w:start w:val="1"/>
+      <w:numFmt w:val="decimal"/>
+      <w:lvlText w:val="%1."/>
+      <w:lvlJc w:val="left"/>
+      <w:pPr>
+        <w:ind w:left="720" w:hanging="360"/>
+      </w:pPr>
+      <w:rPr>
+        <w:rFonts w:hint="default"/>
+      </w:rPr>
+    </w:lvl>
+    <w:lvl w:ilvl="1" w:tplc="300A0019" w:tentative="1">
+      <w:start w:val="1"/>
+      <w:numFmt w:val="lowerLetter"/>
+      <w:lvlText w:val="%2."/>
+      <w:lvlJc w:val="left"/>
+      <w:pPr>
+        <w:ind w:left="1440" w:hanging="360"/>
+      </w:pPr>
+    </w:lvl>
+    <w:lvl w:ilvl="2" w:tplc="300A001B" w:tentative="1">
+      <w:start w:val="1"/>
+      <w:numFmt w:val="lowerRoman"/>
+      <w:lvlText w:val="%3."/>
+      <w:lvlJc w:val="right"/>
+      <w:pPr>
+        <w:ind w:left="2160" w:hanging="180"/>
+      </w:pPr>
+    </w:lvl>
+    <w:lvl w:ilvl="3" w:tplc="300A000F" w:tentative="1">
+      <w:start w:val="1"/>
+      <w:numFmt w:val="decimal"/>
+      <w:lvlText w:val="%4."/>
+      <w:lvlJc w:val="left"/>
+      <w:pPr>
+        <w:ind w:left="2880" w:hanging="360"/>
+      </w:pPr>
+    </w:lvl>
+    <w:lvl w:ilvl="4" w:tplc="300A0019" w:tentative="1">
+      <w:start w:val="1"/>
+      <w:numFmt w:val="lowerLetter"/>
+      <w:lvlText w:val="%5."/>
+      <w:lvlJc w:val="left"/>
+      <w:pPr>
+        <w:ind w:left="3600" w:hanging="360"/>
+      </w:pPr>
+    </w:lvl>
+    <w:lvl w:ilvl="5" w:tplc="300A001B" w:tentative="1">
+      <w:start w:val="1"/>
+      <w:numFmt w:val="lowerRoman"/>
+      <w:lvlText w:val="%6."/>
+      <w:lvlJc w:val="right"/>
+      <w:pPr>
+        <w:ind w:left="4320" w:hanging="180"/>
+      </w:pPr>
+    </w:lvl>
+    <w:lvl w:ilvl="6" w:tplc="300A000F" w:tentative="1">
+      <w:start w:val="1"/>
+      <w:numFmt w:val="decimal"/>
+      <w:lvlText w:val="%7."/>
+      <w:lvlJc w:val="left"/>
+      <w:pPr>
+        <w:ind w:left="5040" w:hanging="360"/>
+      </w:pPr>
+    </w:lvl>
+    <w:lvl w:ilvl="7" w:tplc="300A0019" w:tentative="1">
+      <w:start w:val="1"/>
+      <w:numFmt w:val="lowerLetter"/>
+      <w:lvlText w:val="%8."/>
+      <w:lvlJc w:val="left"/>
+      <w:pPr>
+        <w:ind w:left="5760" w:hanging="360"/>
+      </w:pPr>
+    </w:lvl>
+    <w:lvl w:ilvl="8" w:tplc="300A001B" w:tentative="1">
+      <w:start w:val="1"/>
+      <w:numFmt w:val="lowerRoman"/>
+      <w:lvlText w:val="%9."/>
+      <w:lvlJc w:val="right"/>
+      <w:pPr>
+        <w:ind w:left="6480" w:hanging="180"/>
+      </w:pPr>
+    </w:lvl>
+  </w:abstractNum>
+  <w:abstractNum w:abstractNumId="6" w15:restartNumberingAfterBreak="0">
     <w:nsid w:val="1B30291D"/>
     <w:multiLevelType w:val="hybridMultilevel"/>
     <w:tmpl w:val="DE5C0B24"/>
@@ -1888,7 +2556,7 @@
       </w:pPr>
     </w:lvl>
   </w:abstractNum>
-  <w:abstractNum w:abstractNumId="6" w15:restartNumberingAfterBreak="0">
+  <w:abstractNum w:abstractNumId="7" w15:restartNumberingAfterBreak="0">
     <w:nsid w:val="1DC661DC"/>
     <w:multiLevelType w:val="hybridMultilevel"/>
     <w:tmpl w:val="E0EC5EE4"/>
@@ -1974,7 +2642,7 @@
       </w:pPr>
     </w:lvl>
   </w:abstractNum>
-  <w:abstractNum w:abstractNumId="7" w15:restartNumberingAfterBreak="0">
+  <w:abstractNum w:abstractNumId="8" w15:restartNumberingAfterBreak="0">
     <w:nsid w:val="29F31D15"/>
     <w:multiLevelType w:val="hybridMultilevel"/>
     <w:tmpl w:val="E88E52C6"/>
@@ -2060,7 +2728,7 @@
       </w:pPr>
     </w:lvl>
   </w:abstractNum>
-  <w:abstractNum w:abstractNumId="8" w15:restartNumberingAfterBreak="0">
+  <w:abstractNum w:abstractNumId="9" w15:restartNumberingAfterBreak="0">
     <w:nsid w:val="2BA51A1E"/>
     <w:multiLevelType w:val="hybridMultilevel"/>
     <w:tmpl w:val="5442D98C"/>
@@ -2173,7 +2841,7 @@
       </w:rPr>
     </w:lvl>
   </w:abstractNum>
-  <w:abstractNum w:abstractNumId="9" w15:restartNumberingAfterBreak="0">
+  <w:abstractNum w:abstractNumId="10" w15:restartNumberingAfterBreak="0">
     <w:nsid w:val="2F2551E0"/>
     <w:multiLevelType w:val="hybridMultilevel"/>
     <w:tmpl w:val="08760A28"/>
@@ -2286,7 +2954,7 @@
       </w:rPr>
     </w:lvl>
   </w:abstractNum>
-  <w:abstractNum w:abstractNumId="10" w15:restartNumberingAfterBreak="0">
+  <w:abstractNum w:abstractNumId="11" w15:restartNumberingAfterBreak="0">
     <w:nsid w:val="33742666"/>
     <w:multiLevelType w:val="hybridMultilevel"/>
     <w:tmpl w:val="8042089E"/>
@@ -2399,7 +3067,7 @@
       </w:pPr>
     </w:lvl>
   </w:abstractNum>
-  <w:abstractNum w:abstractNumId="11" w15:restartNumberingAfterBreak="0">
+  <w:abstractNum w:abstractNumId="12" w15:restartNumberingAfterBreak="0">
     <w:nsid w:val="33C01045"/>
     <w:multiLevelType w:val="hybridMultilevel"/>
     <w:tmpl w:val="98989C5E"/>
@@ -2485,7 +3153,7 @@
       </w:pPr>
     </w:lvl>
   </w:abstractNum>
-  <w:abstractNum w:abstractNumId="12" w15:restartNumberingAfterBreak="0">
+  <w:abstractNum w:abstractNumId="13" w15:restartNumberingAfterBreak="0">
     <w:nsid w:val="33DC38D8"/>
     <w:multiLevelType w:val="hybridMultilevel"/>
     <w:tmpl w:val="CA6645C2"/>
@@ -2598,7 +3266,7 @@
       </w:rPr>
     </w:lvl>
   </w:abstractNum>
-  <w:abstractNum w:abstractNumId="13" w15:restartNumberingAfterBreak="0">
+  <w:abstractNum w:abstractNumId="14" w15:restartNumberingAfterBreak="0">
     <w:nsid w:val="35054A76"/>
     <w:multiLevelType w:val="multilevel"/>
     <w:tmpl w:val="40404D10"/>
@@ -2714,7 +3382,7 @@
       </w:pPr>
     </w:lvl>
   </w:abstractNum>
-  <w:abstractNum w:abstractNumId="14" w15:restartNumberingAfterBreak="0">
+  <w:abstractNum w:abstractNumId="15" w15:restartNumberingAfterBreak="0">
     <w:nsid w:val="387B1077"/>
     <w:multiLevelType w:val="hybridMultilevel"/>
     <w:tmpl w:val="3DFAF158"/>
@@ -2803,7 +3471,7 @@
       </w:pPr>
     </w:lvl>
   </w:abstractNum>
-  <w:abstractNum w:abstractNumId="15" w15:restartNumberingAfterBreak="0">
+  <w:abstractNum w:abstractNumId="16" w15:restartNumberingAfterBreak="0">
     <w:nsid w:val="3C960F48"/>
     <w:multiLevelType w:val="multilevel"/>
     <w:tmpl w:val="F948DF74"/>
@@ -2952,7 +3620,7 @@
       </w:rPr>
     </w:lvl>
   </w:abstractNum>
-  <w:abstractNum w:abstractNumId="16" w15:restartNumberingAfterBreak="0">
+  <w:abstractNum w:abstractNumId="17" w15:restartNumberingAfterBreak="0">
     <w:nsid w:val="3E7B4695"/>
     <w:multiLevelType w:val="multilevel"/>
     <w:tmpl w:val="2CD8C734"/>
@@ -3101,10 +3769,10 @@
       </w:rPr>
     </w:lvl>
   </w:abstractNum>
-  <w:abstractNum w:abstractNumId="17" w15:restartNumberingAfterBreak="0">
+  <w:abstractNum w:abstractNumId="18" w15:restartNumberingAfterBreak="0">
     <w:nsid w:val="45080B7A"/>
     <w:multiLevelType w:val="multilevel"/>
-    <w:tmpl w:val="181C4BE8"/>
+    <w:tmpl w:val="B906C5CE"/>
     <w:lvl w:ilvl="0">
       <w:start w:val="1"/>
       <w:numFmt w:val="decimal"/>
@@ -3117,17 +3785,18 @@
         <w:ind w:left="720" w:hanging="360"/>
       </w:pPr>
     </w:lvl>
-    <w:lvl w:ilvl="1" w:tentative="1">
-      <w:start w:val="1"/>
-      <w:numFmt w:val="decimal"/>
-      <w:lvlText w:val="%2."/>
-      <w:lvlJc w:val="left"/>
-      <w:pPr>
-        <w:tabs>
-          <w:tab w:val="num" w:pos="1440"/>
-        </w:tabs>
+    <w:lvl w:ilvl="1">
+      <w:start w:val="3"/>
+      <w:numFmt w:val="bullet"/>
+      <w:lvlText w:val="-"/>
+      <w:lvlJc w:val="left"/>
+      <w:pPr>
         <w:ind w:left="1440" w:hanging="360"/>
       </w:pPr>
+      <w:rPr>
+        <w:rFonts w:ascii="Times New Roman" w:eastAsia="Times New Roman" w:hAnsi="Times New Roman" w:cs="Times New Roman" w:hint="default"/>
+        <w:b w:val="0"/>
+      </w:rPr>
     </w:lvl>
     <w:lvl w:ilvl="2" w:tentative="1">
       <w:start w:val="1"/>
@@ -3214,7 +3883,7 @@
       </w:pPr>
     </w:lvl>
   </w:abstractNum>
-  <w:abstractNum w:abstractNumId="18" w15:restartNumberingAfterBreak="0">
+  <w:abstractNum w:abstractNumId="19" w15:restartNumberingAfterBreak="0">
     <w:nsid w:val="52820A2E"/>
     <w:multiLevelType w:val="hybridMultilevel"/>
     <w:tmpl w:val="290E48D6"/>
@@ -3303,7 +3972,7 @@
       </w:pPr>
     </w:lvl>
   </w:abstractNum>
-  <w:abstractNum w:abstractNumId="19" w15:restartNumberingAfterBreak="0">
+  <w:abstractNum w:abstractNumId="20" w15:restartNumberingAfterBreak="0">
     <w:nsid w:val="52DF0BA5"/>
     <w:multiLevelType w:val="hybridMultilevel"/>
     <w:tmpl w:val="B66AA3EC"/>
@@ -3392,7 +4061,7 @@
       </w:pPr>
     </w:lvl>
   </w:abstractNum>
-  <w:abstractNum w:abstractNumId="20" w15:restartNumberingAfterBreak="0">
+  <w:abstractNum w:abstractNumId="21" w15:restartNumberingAfterBreak="0">
     <w:nsid w:val="5838129F"/>
     <w:multiLevelType w:val="hybridMultilevel"/>
     <w:tmpl w:val="0F767B5C"/>
@@ -3505,7 +4174,7 @@
       </w:pPr>
     </w:lvl>
   </w:abstractNum>
-  <w:abstractNum w:abstractNumId="21" w15:restartNumberingAfterBreak="0">
+  <w:abstractNum w:abstractNumId="22" w15:restartNumberingAfterBreak="0">
     <w:nsid w:val="5AB76A72"/>
     <w:multiLevelType w:val="hybridMultilevel"/>
     <w:tmpl w:val="B7A8280C"/>
@@ -3618,7 +4287,7 @@
       </w:pPr>
     </w:lvl>
   </w:abstractNum>
-  <w:abstractNum w:abstractNumId="22" w15:restartNumberingAfterBreak="0">
+  <w:abstractNum w:abstractNumId="23" w15:restartNumberingAfterBreak="0">
     <w:nsid w:val="627E38AE"/>
     <w:multiLevelType w:val="hybridMultilevel"/>
     <w:tmpl w:val="68AAAD40"/>
@@ -3707,7 +4376,7 @@
       </w:pPr>
     </w:lvl>
   </w:abstractNum>
-  <w:abstractNum w:abstractNumId="23" w15:restartNumberingAfterBreak="0">
+  <w:abstractNum w:abstractNumId="24" w15:restartNumberingAfterBreak="0">
     <w:nsid w:val="6440264C"/>
     <w:multiLevelType w:val="hybridMultilevel"/>
     <w:tmpl w:val="BB066968"/>
@@ -3820,7 +4489,7 @@
       </w:rPr>
     </w:lvl>
   </w:abstractNum>
-  <w:abstractNum w:abstractNumId="24" w15:restartNumberingAfterBreak="0">
+  <w:abstractNum w:abstractNumId="25" w15:restartNumberingAfterBreak="0">
     <w:nsid w:val="7A6C51AE"/>
     <w:multiLevelType w:val="multilevel"/>
     <w:tmpl w:val="0C0A0025"/>
@@ -3942,7 +4611,7 @@
       </w:pPr>
     </w:lvl>
   </w:abstractNum>
-  <w:abstractNum w:abstractNumId="25" w15:restartNumberingAfterBreak="0">
+  <w:abstractNum w:abstractNumId="26" w15:restartNumberingAfterBreak="0">
     <w:nsid w:val="7F75012E"/>
     <w:multiLevelType w:val="hybridMultilevel"/>
     <w:tmpl w:val="FE28E0C6"/>
@@ -4056,37 +4725,37 @@
     </w:lvl>
   </w:abstractNum>
   <w:num w:numId="1" w16cid:durableId="924418013">
-    <w:abstractNumId w:val="24"/>
+    <w:abstractNumId w:val="25"/>
   </w:num>
   <w:num w:numId="2" w16cid:durableId="1280185829">
     <w:abstractNumId w:val="1"/>
   </w:num>
   <w:num w:numId="3" w16cid:durableId="1688481470">
+    <w:abstractNumId w:val="9"/>
+  </w:num>
+  <w:num w:numId="4" w16cid:durableId="1243642208">
+    <w:abstractNumId w:val="12"/>
+  </w:num>
+  <w:num w:numId="5" w16cid:durableId="222646744">
+    <w:abstractNumId w:val="23"/>
+  </w:num>
+  <w:num w:numId="6" w16cid:durableId="529077044">
+    <w:abstractNumId w:val="26"/>
+  </w:num>
+  <w:num w:numId="7" w16cid:durableId="1036932319">
+    <w:abstractNumId w:val="24"/>
+  </w:num>
+  <w:num w:numId="8" w16cid:durableId="1209957522">
+    <w:abstractNumId w:val="19"/>
+  </w:num>
+  <w:num w:numId="9" w16cid:durableId="1214081864">
+    <w:abstractNumId w:val="20"/>
+  </w:num>
+  <w:num w:numId="10" w16cid:durableId="279387227">
     <w:abstractNumId w:val="8"/>
   </w:num>
-  <w:num w:numId="4" w16cid:durableId="1243642208">
-    <w:abstractNumId w:val="11"/>
-  </w:num>
-  <w:num w:numId="5" w16cid:durableId="222646744">
-    <w:abstractNumId w:val="22"/>
-  </w:num>
-  <w:num w:numId="6" w16cid:durableId="529077044">
-    <w:abstractNumId w:val="25"/>
-  </w:num>
-  <w:num w:numId="7" w16cid:durableId="1036932319">
-    <w:abstractNumId w:val="23"/>
-  </w:num>
-  <w:num w:numId="8" w16cid:durableId="1209957522">
-    <w:abstractNumId w:val="18"/>
-  </w:num>
-  <w:num w:numId="9" w16cid:durableId="1214081864">
-    <w:abstractNumId w:val="19"/>
-  </w:num>
-  <w:num w:numId="10" w16cid:durableId="279387227">
+  <w:num w:numId="11" w16cid:durableId="411856646">
     <w:abstractNumId w:val="7"/>
-  </w:num>
-  <w:num w:numId="11" w16cid:durableId="411856646">
-    <w:abstractNumId w:val="6"/>
   </w:num>
   <w:num w:numId="12" w16cid:durableId="1731541225">
     <w:abstractNumId w:val="4"/>
@@ -4095,50 +4764,53 @@
     <w:abstractNumId w:val="0"/>
   </w:num>
   <w:num w:numId="14" w16cid:durableId="330258663">
-    <w:abstractNumId w:val="20"/>
+    <w:abstractNumId w:val="21"/>
   </w:num>
   <w:num w:numId="15" w16cid:durableId="1150901435">
     <w:abstractNumId w:val="3"/>
   </w:num>
   <w:num w:numId="16" w16cid:durableId="1643339909">
-    <w:abstractNumId w:val="14"/>
+    <w:abstractNumId w:val="15"/>
   </w:num>
   <w:num w:numId="17" w16cid:durableId="864371406">
-    <w:abstractNumId w:val="21"/>
+    <w:abstractNumId w:val="22"/>
   </w:num>
   <w:num w:numId="18" w16cid:durableId="444689555">
-    <w:abstractNumId w:val="10"/>
+    <w:abstractNumId w:val="11"/>
   </w:num>
   <w:num w:numId="19" w16cid:durableId="1646154086">
-    <w:abstractNumId w:val="5"/>
+    <w:abstractNumId w:val="6"/>
   </w:num>
   <w:num w:numId="20" w16cid:durableId="2020153781">
-    <w:abstractNumId w:val="15"/>
+    <w:abstractNumId w:val="16"/>
   </w:num>
   <w:num w:numId="21" w16cid:durableId="770324413">
     <w:abstractNumId w:val="2"/>
   </w:num>
   <w:num w:numId="22" w16cid:durableId="754207780">
+    <w:abstractNumId w:val="14"/>
+  </w:num>
+  <w:num w:numId="23" w16cid:durableId="1376539342">
+    <w:abstractNumId w:val="17"/>
+  </w:num>
+  <w:num w:numId="24" w16cid:durableId="2062509103">
     <w:abstractNumId w:val="13"/>
   </w:num>
-  <w:num w:numId="23" w16cid:durableId="1376539342">
-    <w:abstractNumId w:val="16"/>
-  </w:num>
-  <w:num w:numId="24" w16cid:durableId="2062509103">
-    <w:abstractNumId w:val="12"/>
-  </w:num>
   <w:num w:numId="25" w16cid:durableId="1072118198">
-    <w:abstractNumId w:val="9"/>
+    <w:abstractNumId w:val="10"/>
   </w:num>
   <w:num w:numId="26" w16cid:durableId="1228027948">
-    <w:abstractNumId w:val="17"/>
+    <w:abstractNumId w:val="18"/>
+  </w:num>
+  <w:num w:numId="27" w16cid:durableId="2095320840">
+    <w:abstractNumId w:val="5"/>
   </w:num>
   <w:numIdMacAtCleanup w:val="3"/>
 </w:numbering>
 </file>
 
 <file path=word/styles.xml><?xml version="1.0" encoding="utf-8"?>
-<w:styles xmlns:mc="http://schemas.openxmlformats.org/markup-compatibility/2006" xmlns:r="http://schemas.openxmlformats.org/officeDocument/2006/relationships" xmlns:w="http://schemas.openxmlformats.org/wordprocessingml/2006/main" xmlns:w14="http://schemas.microsoft.com/office/word/2010/wordml" xmlns:w15="http://schemas.microsoft.com/office/word/2012/wordml" xmlns:w16cex="http://schemas.microsoft.com/office/word/2018/wordml/cex" xmlns:w16cid="http://schemas.microsoft.com/office/word/2016/wordml/cid" xmlns:w16="http://schemas.microsoft.com/office/word/2018/wordml" xmlns:w16sdtdh="http://schemas.microsoft.com/office/word/2020/wordml/sdtdatahash" xmlns:w16se="http://schemas.microsoft.com/office/word/2015/wordml/symex" mc:Ignorable="w14 w15 w16se w16cid w16 w16cex w16sdtdh">
+<w:styles xmlns:mc="http://schemas.openxmlformats.org/markup-compatibility/2006" xmlns:r="http://schemas.openxmlformats.org/officeDocument/2006/relationships" xmlns:w="http://schemas.openxmlformats.org/wordprocessingml/2006/main" xmlns:w14="http://schemas.microsoft.com/office/word/2010/wordml" xmlns:w15="http://schemas.microsoft.com/office/word/2012/wordml" xmlns:w16cex="http://schemas.microsoft.com/office/word/2018/wordml/cex" xmlns:w16cid="http://schemas.microsoft.com/office/word/2016/wordml/cid" xmlns:w16="http://schemas.microsoft.com/office/word/2018/wordml" xmlns:w16du="http://schemas.microsoft.com/office/word/2023/wordml/word16du" xmlns:w16sdtdh="http://schemas.microsoft.com/office/word/2020/wordml/sdtdatahash" xmlns:w16sdtfl="http://schemas.microsoft.com/office/word/2024/wordml/sdtformatlock" xmlns:w16se="http://schemas.microsoft.com/office/word/2015/wordml/symex" mc:Ignorable="w14 w15 w16se w16cid w16 w16cex w16sdtdh w16sdtfl w16du">
   <w:docDefaults>
     <w:rPrDefault>
       <w:rPr>
@@ -4725,6 +5397,7 @@
   <w:style w:type="character" w:default="1" w:styleId="Fuentedeprrafopredeter">
     <w:name w:val="Default Paragraph Font"/>
     <w:uiPriority w:val="1"/>
+    <w:semiHidden/>
     <w:unhideWhenUsed/>
   </w:style>
   <w:style w:type="table" w:default="1" w:styleId="Tablanormal">

</xml_diff>

<commit_message>
Logica ETL y KNIME
</commit_message>
<xml_diff>
--- a/proyecto analisis.docx
+++ b/proyecto analisis.docx
@@ -241,7 +241,7 @@
                         </a:ln>
                         <a:extLst>
                           <a:ext uri="{909E8E84-426E-40dd-AFC4-6F175D3DCCD1}">
-                            <a14:hiddenFill xmlns="" xmlns:mo="http://schemas.microsoft.com/office/mac/office/2008/main" xmlns:mv="urn:schemas-microsoft-com:mac:vml" xmlns:o="urn:schemas-microsoft-com:office:office" xmlns:v="urn:schemas-microsoft-com:vml" xmlns:w10="urn:schemas-microsoft-com:office:word" xmlns:w="http://schemas.openxmlformats.org/wordprocessingml/2006/main" xmlns:a14="http://schemas.microsoft.com/office/drawing/2010/main">
+                            <a14:hiddenFill xmlns:a14="http://schemas.microsoft.com/office/drawing/2010/main" xmlns:w="http://schemas.openxmlformats.org/wordprocessingml/2006/main" xmlns:w10="urn:schemas-microsoft-com:office:word" xmlns:v="urn:schemas-microsoft-com:vml" xmlns:o="urn:schemas-microsoft-com:office:office" xmlns:mv="urn:schemas-microsoft-com:mac:vml" xmlns:mo="http://schemas.microsoft.com/office/mac/office/2008/main" xmlns="">
                               <a:noFill/>
                             </a14:hiddenFill>
                           </a:ext>
@@ -1080,19 +1080,11 @@
           <w:bCs/>
         </w:rPr>
       </w:pPr>
-      <w:proofErr w:type="spellStart"/>
-      <w:r>
-        <w:rPr>
-          <w:bCs/>
-        </w:rPr>
-        <w:t>Ieps_proyecto</w:t>
-      </w:r>
-      <w:proofErr w:type="spellEnd"/>
-      <w:r>
-        <w:rPr>
-          <w:bCs/>
-        </w:rPr>
-        <w:t xml:space="preserve"> inversión.</w:t>
+      <w:r>
+        <w:rPr>
+          <w:bCs/>
+        </w:rPr>
+        <w:t>Ieps_proyecto inversión.</w:t>
       </w:r>
     </w:p>
     <w:p>
@@ -1120,34 +1112,12 @@
           <w:bCs/>
         </w:rPr>
       </w:pPr>
-      <w:proofErr w:type="spellStart"/>
       <w:r>
         <w:rPr>
           <w:bCs/>
         </w:rPr>
         <w:lastRenderedPageBreak/>
-        <w:t>Inec</w:t>
-      </w:r>
-      <w:proofErr w:type="spellEnd"/>
-      <w:r>
-        <w:rPr>
-          <w:bCs/>
-        </w:rPr>
-        <w:t xml:space="preserve"> </w:t>
-      </w:r>
-      <w:proofErr w:type="spellStart"/>
-      <w:r>
-        <w:rPr>
-          <w:bCs/>
-        </w:rPr>
-        <w:t>enemdu</w:t>
-      </w:r>
-      <w:proofErr w:type="spellEnd"/>
-      <w:r>
-        <w:rPr>
-          <w:bCs/>
-        </w:rPr>
-        <w:t xml:space="preserve"> consumido, mies bonos pensiones,</w:t>
+        <w:t>Inec enemdu consumido, mies bonos pensiones,</w:t>
       </w:r>
     </w:p>
     <w:p>
@@ -1175,19 +1145,11 @@
           <w:bCs/>
         </w:rPr>
       </w:pPr>
-      <w:proofErr w:type="spellStart"/>
-      <w:r>
-        <w:rPr>
-          <w:bCs/>
-        </w:rPr>
-        <w:t>Esporte</w:t>
-      </w:r>
-      <w:proofErr w:type="spellEnd"/>
-      <w:r>
-        <w:rPr>
-          <w:bCs/>
-        </w:rPr>
-        <w:t xml:space="preserve"> estadístico mayo</w:t>
+      <w:r>
+        <w:rPr>
+          <w:bCs/>
+        </w:rPr>
+        <w:t>Esporte estadístico mayo</w:t>
       </w:r>
     </w:p>
     <w:p>
@@ -1203,21 +1165,13 @@
         <w:rPr>
           <w:bCs/>
         </w:rPr>
-        <w:t xml:space="preserve">Urs personas </w:t>
-      </w:r>
-      <w:proofErr w:type="spellStart"/>
-      <w:r>
-        <w:rPr>
-          <w:bCs/>
-        </w:rPr>
-        <w:t>dd</w:t>
-      </w:r>
-      <w:proofErr w:type="spellEnd"/>
-      <w:r>
-        <w:rPr>
-          <w:bCs/>
-        </w:rPr>
-        <w:t xml:space="preserve"> 2024</w:t>
+        <w:t>Urs personas dd 2024</w:t>
+      </w:r>
+      <w:r>
+        <w:rPr>
+          <w:bCs/>
+        </w:rPr>
+        <w:t>.</w:t>
       </w:r>
     </w:p>
     <w:p>
@@ -1236,21 +1190,7 @@
         <w:rPr>
           <w:b/>
         </w:rPr>
-        <w:t xml:space="preserve">Fase </w:t>
-      </w:r>
-      <w:proofErr w:type="spellStart"/>
-      <w:r>
-        <w:rPr>
-          <w:b/>
-        </w:rPr>
-        <w:t>Transformacion</w:t>
-      </w:r>
-      <w:proofErr w:type="spellEnd"/>
-      <w:r>
-        <w:rPr>
-          <w:b/>
-        </w:rPr>
-        <w:t xml:space="preserve">: </w:t>
+        <w:t xml:space="preserve">Fase Transformacion: </w:t>
       </w:r>
     </w:p>
     <w:p>
@@ -1266,55 +1206,349 @@
         <w:rPr>
           <w:bCs/>
         </w:rPr>
-        <w:t xml:space="preserve">Se utiliza nodos JSON Path, </w:t>
-      </w:r>
-      <w:proofErr w:type="spellStart"/>
-      <w:r>
-        <w:rPr>
-          <w:bCs/>
-        </w:rPr>
-        <w:t>Ungroup</w:t>
-      </w:r>
-      <w:proofErr w:type="spellEnd"/>
-      <w:r>
-        <w:rPr>
-          <w:bCs/>
-        </w:rPr>
-        <w:t xml:space="preserve">, JSON table para extraer datos JSON también el sacar datos tipo CVS, Excel, </w:t>
-      </w:r>
-      <w:proofErr w:type="spellStart"/>
-      <w:r>
-        <w:rPr>
-          <w:bCs/>
-        </w:rPr>
-        <w:t>sqlite</w:t>
-      </w:r>
-      <w:proofErr w:type="spellEnd"/>
-      <w:r>
-        <w:rPr>
-          <w:bCs/>
-        </w:rPr>
-        <w:t xml:space="preserve"> con nodos para lectura para revisión de los datos requeridos.</w:t>
-      </w:r>
-      <w:r>
-        <w:rPr>
-          <w:bCs/>
-        </w:rPr>
-        <w:t xml:space="preserve"> Los datos creados a partir de scripts del programa </w:t>
-      </w:r>
-      <w:proofErr w:type="spellStart"/>
-      <w:r>
-        <w:rPr>
-          <w:bCs/>
-        </w:rPr>
-        <w:t>jupyter</w:t>
-      </w:r>
-      <w:proofErr w:type="spellEnd"/>
-      <w:r>
-        <w:rPr>
-          <w:bCs/>
-        </w:rPr>
-        <w:t xml:space="preserve"> notebook.</w:t>
+        <w:t>Se utiliza nodos JSON Path, Ungroup, JSON table para extraer datos JSON también el sacar datos tipo CVS, Excel, sqlite con nodos para lectura para revisión de los datos requeridos.</w:t>
+      </w:r>
+      <w:r>
+        <w:rPr>
+          <w:bCs/>
+        </w:rPr>
+        <w:t xml:space="preserve"> Los datos creados a partir de scripts del programa jupyter notebook.</w:t>
+      </w:r>
+    </w:p>
+    <w:p>
+      <w:pPr>
+        <w:pStyle w:val="Prrafodelista"/>
+        <w:spacing w:after="240"/>
+        <w:ind w:left="1440"/>
+        <w:rPr>
+          <w:bCs/>
+        </w:rPr>
+      </w:pPr>
+      <w:r>
+        <w:rPr>
+          <w:bCs/>
+        </w:rPr>
+        <w:drawing>
+          <wp:inline distT="0" distB="0" distL="0" distR="0" wp14:anchorId="4235873D" wp14:editId="1A91F5BF">
+            <wp:extent cx="1867161" cy="847843"/>
+            <wp:effectExtent l="0" t="0" r="0" b="0"/>
+            <wp:docPr id="1826167873" name="Imagen 1"/>
+            <wp:cNvGraphicFramePr>
+              <a:graphicFrameLocks xmlns:a="http://schemas.openxmlformats.org/drawingml/2006/main" noChangeAspect="1"/>
+            </wp:cNvGraphicFramePr>
+            <a:graphic xmlns:a="http://schemas.openxmlformats.org/drawingml/2006/main">
+              <a:graphicData uri="http://schemas.openxmlformats.org/drawingml/2006/picture">
+                <pic:pic xmlns:pic="http://schemas.openxmlformats.org/drawingml/2006/picture">
+                  <pic:nvPicPr>
+                    <pic:cNvPr id="1826167873" name=""/>
+                    <pic:cNvPicPr/>
+                  </pic:nvPicPr>
+                  <pic:blipFill>
+                    <a:blip r:embed="rId12"/>
+                    <a:stretch>
+                      <a:fillRect/>
+                    </a:stretch>
+                  </pic:blipFill>
+                  <pic:spPr>
+                    <a:xfrm>
+                      <a:off x="0" y="0"/>
+                      <a:ext cx="1867161" cy="847843"/>
+                    </a:xfrm>
+                    <a:prstGeom prst="rect">
+                      <a:avLst/>
+                    </a:prstGeom>
+                  </pic:spPr>
+                </pic:pic>
+              </a:graphicData>
+            </a:graphic>
+          </wp:inline>
+        </w:drawing>
+      </w:r>
+    </w:p>
+    <w:p>
+      <w:pPr>
+        <w:pStyle w:val="Prrafodelista"/>
+        <w:spacing w:after="240"/>
+        <w:ind w:left="1440"/>
+        <w:rPr>
+          <w:bCs/>
+        </w:rPr>
+      </w:pPr>
+      <w:r>
+        <w:rPr>
+          <w:bCs/>
+        </w:rPr>
+        <w:t>SQLite Connector para ingresar los datos.</w:t>
+      </w:r>
+    </w:p>
+    <w:p>
+      <w:pPr>
+        <w:pStyle w:val="Prrafodelista"/>
+        <w:spacing w:after="240"/>
+        <w:ind w:left="1440"/>
+        <w:rPr>
+          <w:bCs/>
+        </w:rPr>
+      </w:pPr>
+      <w:r>
+        <w:rPr>
+          <w:bCs/>
+        </w:rPr>
+        <w:drawing>
+          <wp:inline distT="0" distB="0" distL="0" distR="0" wp14:anchorId="25484A49" wp14:editId="6156A4DD">
+            <wp:extent cx="847843" cy="866896"/>
+            <wp:effectExtent l="0" t="0" r="9525" b="9525"/>
+            <wp:docPr id="1156470899" name="Imagen 1"/>
+            <wp:cNvGraphicFramePr>
+              <a:graphicFrameLocks xmlns:a="http://schemas.openxmlformats.org/drawingml/2006/main" noChangeAspect="1"/>
+            </wp:cNvGraphicFramePr>
+            <a:graphic xmlns:a="http://schemas.openxmlformats.org/drawingml/2006/main">
+              <a:graphicData uri="http://schemas.openxmlformats.org/drawingml/2006/picture">
+                <pic:pic xmlns:pic="http://schemas.openxmlformats.org/drawingml/2006/picture">
+                  <pic:nvPicPr>
+                    <pic:cNvPr id="1156470899" name=""/>
+                    <pic:cNvPicPr/>
+                  </pic:nvPicPr>
+                  <pic:blipFill>
+                    <a:blip r:embed="rId13"/>
+                    <a:stretch>
+                      <a:fillRect/>
+                    </a:stretch>
+                  </pic:blipFill>
+                  <pic:spPr>
+                    <a:xfrm>
+                      <a:off x="0" y="0"/>
+                      <a:ext cx="847843" cy="866896"/>
+                    </a:xfrm>
+                    <a:prstGeom prst="rect">
+                      <a:avLst/>
+                    </a:prstGeom>
+                  </pic:spPr>
+                </pic:pic>
+              </a:graphicData>
+            </a:graphic>
+          </wp:inline>
+        </w:drawing>
+      </w:r>
+    </w:p>
+    <w:p>
+      <w:pPr>
+        <w:pStyle w:val="Prrafodelista"/>
+        <w:spacing w:after="240"/>
+        <w:ind w:left="1440"/>
+        <w:rPr>
+          <w:bCs/>
+        </w:rPr>
+      </w:pPr>
+      <w:r>
+        <w:rPr>
+          <w:bCs/>
+        </w:rPr>
+        <w:t xml:space="preserve">CSV para </w:t>
+      </w:r>
+      <w:r>
+        <w:rPr>
+          <w:bCs/>
+        </w:rPr>
+        <w:t>lectura de datos.</w:t>
+      </w:r>
+    </w:p>
+    <w:p>
+      <w:pPr>
+        <w:pStyle w:val="Prrafodelista"/>
+        <w:spacing w:after="240"/>
+        <w:ind w:left="1440"/>
+        <w:rPr>
+          <w:bCs/>
+        </w:rPr>
+      </w:pPr>
+      <w:r>
+        <w:rPr>
+          <w:bCs/>
+        </w:rPr>
+        <w:drawing>
+          <wp:inline distT="0" distB="0" distL="0" distR="0" wp14:anchorId="62635E59" wp14:editId="192772F2">
+            <wp:extent cx="809738" cy="876422"/>
+            <wp:effectExtent l="0" t="0" r="9525" b="0"/>
+            <wp:docPr id="1319271315" name="Imagen 1"/>
+            <wp:cNvGraphicFramePr>
+              <a:graphicFrameLocks xmlns:a="http://schemas.openxmlformats.org/drawingml/2006/main" noChangeAspect="1"/>
+            </wp:cNvGraphicFramePr>
+            <a:graphic xmlns:a="http://schemas.openxmlformats.org/drawingml/2006/main">
+              <a:graphicData uri="http://schemas.openxmlformats.org/drawingml/2006/picture">
+                <pic:pic xmlns:pic="http://schemas.openxmlformats.org/drawingml/2006/picture">
+                  <pic:nvPicPr>
+                    <pic:cNvPr id="1319271315" name=""/>
+                    <pic:cNvPicPr/>
+                  </pic:nvPicPr>
+                  <pic:blipFill>
+                    <a:blip r:embed="rId14"/>
+                    <a:stretch>
+                      <a:fillRect/>
+                    </a:stretch>
+                  </pic:blipFill>
+                  <pic:spPr>
+                    <a:xfrm>
+                      <a:off x="0" y="0"/>
+                      <a:ext cx="809738" cy="876422"/>
+                    </a:xfrm>
+                    <a:prstGeom prst="rect">
+                      <a:avLst/>
+                    </a:prstGeom>
+                  </pic:spPr>
+                </pic:pic>
+              </a:graphicData>
+            </a:graphic>
+          </wp:inline>
+        </w:drawing>
+      </w:r>
+    </w:p>
+    <w:p>
+      <w:pPr>
+        <w:pStyle w:val="Prrafodelista"/>
+        <w:spacing w:after="240"/>
+        <w:ind w:left="1440"/>
+        <w:rPr>
+          <w:bCs/>
+        </w:rPr>
+      </w:pPr>
+      <w:r>
+        <w:rPr>
+          <w:bCs/>
+        </w:rPr>
+        <w:t xml:space="preserve">JSON para lectura de datos pero solo en modelo JSON para ello se necesita </w:t>
+      </w:r>
+    </w:p>
+    <w:p>
+      <w:pPr>
+        <w:pStyle w:val="Prrafodelista"/>
+        <w:spacing w:after="240"/>
+        <w:ind w:left="1440"/>
+        <w:rPr>
+          <w:bCs/>
+        </w:rPr>
+      </w:pPr>
+      <w:r>
+        <w:rPr>
+          <w:bCs/>
+        </w:rPr>
+        <w:drawing>
+          <wp:inline distT="0" distB="0" distL="0" distR="0" wp14:anchorId="7A9AF501" wp14:editId="25B61523">
+            <wp:extent cx="1933845" cy="1057423"/>
+            <wp:effectExtent l="0" t="0" r="0" b="9525"/>
+            <wp:docPr id="2119356354" name="Imagen 1"/>
+            <wp:cNvGraphicFramePr>
+              <a:graphicFrameLocks xmlns:a="http://schemas.openxmlformats.org/drawingml/2006/main" noChangeAspect="1"/>
+            </wp:cNvGraphicFramePr>
+            <a:graphic xmlns:a="http://schemas.openxmlformats.org/drawingml/2006/main">
+              <a:graphicData uri="http://schemas.openxmlformats.org/drawingml/2006/picture">
+                <pic:pic xmlns:pic="http://schemas.openxmlformats.org/drawingml/2006/picture">
+                  <pic:nvPicPr>
+                    <pic:cNvPr id="2119356354" name=""/>
+                    <pic:cNvPicPr/>
+                  </pic:nvPicPr>
+                  <pic:blipFill>
+                    <a:blip r:embed="rId15"/>
+                    <a:stretch>
+                      <a:fillRect/>
+                    </a:stretch>
+                  </pic:blipFill>
+                  <pic:spPr>
+                    <a:xfrm>
+                      <a:off x="0" y="0"/>
+                      <a:ext cx="1933845" cy="1057423"/>
+                    </a:xfrm>
+                    <a:prstGeom prst="rect">
+                      <a:avLst/>
+                    </a:prstGeom>
+                  </pic:spPr>
+                </pic:pic>
+              </a:graphicData>
+            </a:graphic>
+          </wp:inline>
+        </w:drawing>
+      </w:r>
+    </w:p>
+    <w:p>
+      <w:pPr>
+        <w:pStyle w:val="Prrafodelista"/>
+        <w:spacing w:after="240"/>
+        <w:ind w:left="1440"/>
+        <w:rPr>
+          <w:bCs/>
+        </w:rPr>
+      </w:pPr>
+      <w:r>
+        <w:rPr>
+          <w:bCs/>
+        </w:rPr>
+        <w:t>Para la vista de datos por formato de tabla de datos.</w:t>
+      </w:r>
+    </w:p>
+    <w:p>
+      <w:pPr>
+        <w:pStyle w:val="Prrafodelista"/>
+        <w:spacing w:after="240"/>
+        <w:ind w:left="1440"/>
+        <w:rPr>
+          <w:bCs/>
+        </w:rPr>
+      </w:pPr>
+      <w:r>
+        <w:rPr>
+          <w:bCs/>
+        </w:rPr>
+        <w:drawing>
+          <wp:inline distT="0" distB="0" distL="0" distR="0" wp14:anchorId="38267939" wp14:editId="37054F0F">
+            <wp:extent cx="781159" cy="733527"/>
+            <wp:effectExtent l="0" t="0" r="0" b="9525"/>
+            <wp:docPr id="124066498" name="Imagen 1"/>
+            <wp:cNvGraphicFramePr>
+              <a:graphicFrameLocks xmlns:a="http://schemas.openxmlformats.org/drawingml/2006/main" noChangeAspect="1"/>
+            </wp:cNvGraphicFramePr>
+            <a:graphic xmlns:a="http://schemas.openxmlformats.org/drawingml/2006/main">
+              <a:graphicData uri="http://schemas.openxmlformats.org/drawingml/2006/picture">
+                <pic:pic xmlns:pic="http://schemas.openxmlformats.org/drawingml/2006/picture">
+                  <pic:nvPicPr>
+                    <pic:cNvPr id="124066498" name=""/>
+                    <pic:cNvPicPr/>
+                  </pic:nvPicPr>
+                  <pic:blipFill>
+                    <a:blip r:embed="rId16"/>
+                    <a:stretch>
+                      <a:fillRect/>
+                    </a:stretch>
+                  </pic:blipFill>
+                  <pic:spPr>
+                    <a:xfrm>
+                      <a:off x="0" y="0"/>
+                      <a:ext cx="781159" cy="733527"/>
+                    </a:xfrm>
+                    <a:prstGeom prst="rect">
+                      <a:avLst/>
+                    </a:prstGeom>
+                  </pic:spPr>
+                </pic:pic>
+              </a:graphicData>
+            </a:graphic>
+          </wp:inline>
+        </w:drawing>
+      </w:r>
+    </w:p>
+    <w:p>
+      <w:pPr>
+        <w:pStyle w:val="Prrafodelista"/>
+        <w:spacing w:after="240"/>
+        <w:ind w:left="1440"/>
+        <w:rPr>
+          <w:bCs/>
+        </w:rPr>
+      </w:pPr>
+      <w:r>
+        <w:rPr>
+          <w:bCs/>
+        </w:rPr>
+        <w:t>Excel para revisión de datos en formato de tabla</w:t>
       </w:r>
     </w:p>
     <w:p>
@@ -1333,21 +1567,7 @@
         <w:rPr>
           <w:bCs/>
         </w:rPr>
-        <w:t xml:space="preserve">Limpieza y reducción de dimensiones: Se normaliza las tablas utilizando nodos como </w:t>
-      </w:r>
-      <w:proofErr w:type="spellStart"/>
-      <w:r>
-        <w:rPr>
-          <w:bCs/>
-        </w:rPr>
-        <w:t>Column</w:t>
-      </w:r>
-      <w:proofErr w:type="spellEnd"/>
-      <w:r>
-        <w:rPr>
-          <w:bCs/>
-        </w:rPr>
-        <w:t xml:space="preserve"> Filter, Row Filter, Row Splitter esto para eliminar columnas redundantes e </w:t>
+        <w:t xml:space="preserve">Limpieza y reducción de dimensiones: Se normaliza las tablas utilizando nodos como Column Filter, Row Filter, Row Splitter esto para eliminar columnas redundantes e </w:t>
       </w:r>
       <w:r>
         <w:rPr>
@@ -1359,35 +1579,261 @@
         <w:rPr>
           <w:bCs/>
         </w:rPr>
-        <w:t xml:space="preserve"> para la optimización de la lectura al momento de la revisión de sus datos, al igual que como se puede ver en el KNIME se utilizo 3 </w:t>
-      </w:r>
-      <w:proofErr w:type="spellStart"/>
-      <w:r>
-        <w:rPr>
-          <w:bCs/>
-        </w:rPr>
-        <w:t>row</w:t>
-      </w:r>
-      <w:proofErr w:type="spellEnd"/>
-      <w:r>
-        <w:rPr>
-          <w:bCs/>
-        </w:rPr>
-        <w:t xml:space="preserve"> </w:t>
-      </w:r>
-      <w:proofErr w:type="spellStart"/>
-      <w:r>
-        <w:rPr>
-          <w:bCs/>
-        </w:rPr>
-        <w:t>splitter</w:t>
-      </w:r>
-      <w:proofErr w:type="spellEnd"/>
-      <w:r>
-        <w:rPr>
-          <w:bCs/>
-        </w:rPr>
-        <w:t xml:space="preserve"> para la división de tablas que se encontraban en su momento unidas.</w:t>
+        <w:t xml:space="preserve"> para la optimización de la lectura al momento de la revisión de sus datos, al igual que como se puede ver en el KNIME se utilizo 3 row splitter para la división de tablas que se encontraban en su momento unidas.</w:t>
+      </w:r>
+    </w:p>
+    <w:p>
+      <w:pPr>
+        <w:pStyle w:val="Prrafodelista"/>
+        <w:spacing w:after="240"/>
+        <w:ind w:left="1440"/>
+        <w:rPr>
+          <w:bCs/>
+        </w:rPr>
+      </w:pPr>
+      <w:r>
+        <w:rPr>
+          <w:bCs/>
+        </w:rPr>
+        <w:drawing>
+          <wp:inline distT="0" distB="0" distL="0" distR="0" wp14:anchorId="67488F5D" wp14:editId="65B0D4C0">
+            <wp:extent cx="724001" cy="762106"/>
+            <wp:effectExtent l="0" t="0" r="0" b="0"/>
+            <wp:docPr id="947913000" name="Imagen 1"/>
+            <wp:cNvGraphicFramePr>
+              <a:graphicFrameLocks xmlns:a="http://schemas.openxmlformats.org/drawingml/2006/main" noChangeAspect="1"/>
+            </wp:cNvGraphicFramePr>
+            <a:graphic xmlns:a="http://schemas.openxmlformats.org/drawingml/2006/main">
+              <a:graphicData uri="http://schemas.openxmlformats.org/drawingml/2006/picture">
+                <pic:pic xmlns:pic="http://schemas.openxmlformats.org/drawingml/2006/picture">
+                  <pic:nvPicPr>
+                    <pic:cNvPr id="947913000" name=""/>
+                    <pic:cNvPicPr/>
+                  </pic:nvPicPr>
+                  <pic:blipFill>
+                    <a:blip r:embed="rId17"/>
+                    <a:stretch>
+                      <a:fillRect/>
+                    </a:stretch>
+                  </pic:blipFill>
+                  <pic:spPr>
+                    <a:xfrm>
+                      <a:off x="0" y="0"/>
+                      <a:ext cx="724001" cy="762106"/>
+                    </a:xfrm>
+                    <a:prstGeom prst="rect">
+                      <a:avLst/>
+                    </a:prstGeom>
+                  </pic:spPr>
+                </pic:pic>
+              </a:graphicData>
+            </a:graphic>
+          </wp:inline>
+        </w:drawing>
+      </w:r>
+    </w:p>
+    <w:p>
+      <w:pPr>
+        <w:pStyle w:val="Prrafodelista"/>
+        <w:spacing w:after="240"/>
+        <w:ind w:left="1440"/>
+        <w:rPr>
+          <w:bCs/>
+        </w:rPr>
+      </w:pPr>
+      <w:r>
+        <w:rPr>
+          <w:bCs/>
+        </w:rPr>
+        <w:t>Filtrado de Columnas</w:t>
+      </w:r>
+    </w:p>
+    <w:p>
+      <w:pPr>
+        <w:pStyle w:val="Prrafodelista"/>
+        <w:spacing w:after="240"/>
+        <w:ind w:left="1440"/>
+        <w:rPr>
+          <w:bCs/>
+        </w:rPr>
+      </w:pPr>
+      <w:r>
+        <w:rPr>
+          <w:bCs/>
+        </w:rPr>
+        <w:drawing>
+          <wp:inline distT="0" distB="0" distL="0" distR="0" wp14:anchorId="29173878" wp14:editId="7ADE233D">
+            <wp:extent cx="685896" cy="762106"/>
+            <wp:effectExtent l="0" t="0" r="0" b="0"/>
+            <wp:docPr id="1631056592" name="Imagen 1"/>
+            <wp:cNvGraphicFramePr>
+              <a:graphicFrameLocks xmlns:a="http://schemas.openxmlformats.org/drawingml/2006/main" noChangeAspect="1"/>
+            </wp:cNvGraphicFramePr>
+            <a:graphic xmlns:a="http://schemas.openxmlformats.org/drawingml/2006/main">
+              <a:graphicData uri="http://schemas.openxmlformats.org/drawingml/2006/picture">
+                <pic:pic xmlns:pic="http://schemas.openxmlformats.org/drawingml/2006/picture">
+                  <pic:nvPicPr>
+                    <pic:cNvPr id="1631056592" name=""/>
+                    <pic:cNvPicPr/>
+                  </pic:nvPicPr>
+                  <pic:blipFill>
+                    <a:blip r:embed="rId18"/>
+                    <a:stretch>
+                      <a:fillRect/>
+                    </a:stretch>
+                  </pic:blipFill>
+                  <pic:spPr>
+                    <a:xfrm>
+                      <a:off x="0" y="0"/>
+                      <a:ext cx="685896" cy="762106"/>
+                    </a:xfrm>
+                    <a:prstGeom prst="rect">
+                      <a:avLst/>
+                    </a:prstGeom>
+                  </pic:spPr>
+                </pic:pic>
+              </a:graphicData>
+            </a:graphic>
+          </wp:inline>
+        </w:drawing>
+      </w:r>
+    </w:p>
+    <w:p>
+      <w:pPr>
+        <w:pStyle w:val="Prrafodelista"/>
+        <w:spacing w:after="240"/>
+        <w:ind w:left="1440"/>
+        <w:rPr>
+          <w:bCs/>
+        </w:rPr>
+      </w:pPr>
+      <w:r>
+        <w:rPr>
+          <w:bCs/>
+        </w:rPr>
+        <w:t>Filtro por filas.</w:t>
+      </w:r>
+    </w:p>
+    <w:p>
+      <w:pPr>
+        <w:pStyle w:val="Prrafodelista"/>
+        <w:spacing w:after="240"/>
+        <w:ind w:left="1440"/>
+        <w:rPr>
+          <w:bCs/>
+        </w:rPr>
+      </w:pPr>
+      <w:r>
+        <w:rPr>
+          <w:bCs/>
+        </w:rPr>
+        <w:drawing>
+          <wp:inline distT="0" distB="0" distL="0" distR="0" wp14:anchorId="2938EEC2" wp14:editId="082C629E">
+            <wp:extent cx="638264" cy="752580"/>
+            <wp:effectExtent l="0" t="0" r="9525" b="9525"/>
+            <wp:docPr id="1729821493" name="Imagen 1"/>
+            <wp:cNvGraphicFramePr>
+              <a:graphicFrameLocks xmlns:a="http://schemas.openxmlformats.org/drawingml/2006/main" noChangeAspect="1"/>
+            </wp:cNvGraphicFramePr>
+            <a:graphic xmlns:a="http://schemas.openxmlformats.org/drawingml/2006/main">
+              <a:graphicData uri="http://schemas.openxmlformats.org/drawingml/2006/picture">
+                <pic:pic xmlns:pic="http://schemas.openxmlformats.org/drawingml/2006/picture">
+                  <pic:nvPicPr>
+                    <pic:cNvPr id="1729821493" name=""/>
+                    <pic:cNvPicPr/>
+                  </pic:nvPicPr>
+                  <pic:blipFill>
+                    <a:blip r:embed="rId19"/>
+                    <a:stretch>
+                      <a:fillRect/>
+                    </a:stretch>
+                  </pic:blipFill>
+                  <pic:spPr>
+                    <a:xfrm>
+                      <a:off x="0" y="0"/>
+                      <a:ext cx="638264" cy="752580"/>
+                    </a:xfrm>
+                    <a:prstGeom prst="rect">
+                      <a:avLst/>
+                    </a:prstGeom>
+                  </pic:spPr>
+                </pic:pic>
+              </a:graphicData>
+            </a:graphic>
+          </wp:inline>
+        </w:drawing>
+      </w:r>
+    </w:p>
+    <w:p>
+      <w:pPr>
+        <w:pStyle w:val="Prrafodelista"/>
+        <w:spacing w:after="240"/>
+        <w:ind w:left="1440"/>
+        <w:rPr>
+          <w:bCs/>
+        </w:rPr>
+      </w:pPr>
+      <w:r>
+        <w:rPr>
+          <w:bCs/>
+        </w:rPr>
+        <w:t>Dividir por</w:t>
+      </w:r>
+      <w:r>
+        <w:rPr>
+          <w:bCs/>
+        </w:rPr>
+        <w:t xml:space="preserve"> filas especificas</w:t>
+      </w:r>
+    </w:p>
+    <w:p>
+      <w:pPr>
+        <w:pStyle w:val="Prrafodelista"/>
+        <w:spacing w:after="240"/>
+        <w:ind w:left="1440"/>
+        <w:rPr>
+          <w:bCs/>
+        </w:rPr>
+      </w:pPr>
+      <w:r>
+        <w:rPr>
+          <w:bCs/>
+        </w:rPr>
+        <w:drawing>
+          <wp:inline distT="0" distB="0" distL="0" distR="0" wp14:anchorId="7C8A5B12" wp14:editId="62D4B274">
+            <wp:extent cx="638264" cy="752580"/>
+            <wp:effectExtent l="0" t="0" r="9525" b="9525"/>
+            <wp:docPr id="902094272" name="Imagen 1"/>
+            <wp:cNvGraphicFramePr>
+              <a:graphicFrameLocks xmlns:a="http://schemas.openxmlformats.org/drawingml/2006/main" noChangeAspect="1"/>
+            </wp:cNvGraphicFramePr>
+            <a:graphic xmlns:a="http://schemas.openxmlformats.org/drawingml/2006/main">
+              <a:graphicData uri="http://schemas.openxmlformats.org/drawingml/2006/picture">
+                <pic:pic xmlns:pic="http://schemas.openxmlformats.org/drawingml/2006/picture">
+                  <pic:nvPicPr>
+                    <pic:cNvPr id="902094272" name=""/>
+                    <pic:cNvPicPr/>
+                  </pic:nvPicPr>
+                  <pic:blipFill>
+                    <a:blip r:embed="rId19"/>
+                    <a:stretch>
+                      <a:fillRect/>
+                    </a:stretch>
+                  </pic:blipFill>
+                  <pic:spPr>
+                    <a:xfrm>
+                      <a:off x="0" y="0"/>
+                      <a:ext cx="638264" cy="752580"/>
+                    </a:xfrm>
+                    <a:prstGeom prst="rect">
+                      <a:avLst/>
+                    </a:prstGeom>
+                  </pic:spPr>
+                </pic:pic>
+              </a:graphicData>
+            </a:graphic>
+          </wp:inline>
+        </w:drawing>
       </w:r>
     </w:p>
     <w:p>
@@ -1412,91 +1858,7 @@
         <w:rPr>
           <w:bCs/>
         </w:rPr>
-        <w:t>En este lado empezamos a renombrar atributos, también eliminar datos nulos, convertir los datos a sus respectivos tipo de datos (</w:t>
-      </w:r>
-      <w:proofErr w:type="spellStart"/>
-      <w:r>
-        <w:rPr>
-          <w:bCs/>
-        </w:rPr>
-        <w:t>int</w:t>
-      </w:r>
-      <w:proofErr w:type="spellEnd"/>
-      <w:r>
-        <w:rPr>
-          <w:bCs/>
-        </w:rPr>
-        <w:t xml:space="preserve">, </w:t>
-      </w:r>
-      <w:proofErr w:type="spellStart"/>
-      <w:r>
-        <w:rPr>
-          <w:bCs/>
-        </w:rPr>
-        <w:t>float</w:t>
-      </w:r>
-      <w:proofErr w:type="spellEnd"/>
-      <w:r>
-        <w:rPr>
-          <w:bCs/>
-        </w:rPr>
-        <w:t xml:space="preserve">, </w:t>
-      </w:r>
-      <w:proofErr w:type="spellStart"/>
-      <w:r>
-        <w:rPr>
-          <w:bCs/>
-        </w:rPr>
-        <w:t>string</w:t>
-      </w:r>
-      <w:proofErr w:type="spellEnd"/>
-      <w:r>
-        <w:rPr>
-          <w:bCs/>
-        </w:rPr>
-        <w:t xml:space="preserve">, date) en este utilizamos los nodos </w:t>
-      </w:r>
-      <w:proofErr w:type="spellStart"/>
-      <w:r>
-        <w:rPr>
-          <w:bCs/>
-        </w:rPr>
-        <w:t>Column</w:t>
-      </w:r>
-      <w:proofErr w:type="spellEnd"/>
-      <w:r>
-        <w:rPr>
-          <w:bCs/>
-        </w:rPr>
-        <w:t xml:space="preserve"> </w:t>
-      </w:r>
-      <w:proofErr w:type="spellStart"/>
-      <w:r>
-        <w:rPr>
-          <w:bCs/>
-        </w:rPr>
-        <w:t>Rename</w:t>
-      </w:r>
-      <w:proofErr w:type="spellEnd"/>
-      <w:r>
-        <w:rPr>
-          <w:bCs/>
-        </w:rPr>
-        <w:t xml:space="preserve">, String </w:t>
-      </w:r>
-      <w:proofErr w:type="spellStart"/>
-      <w:r>
-        <w:rPr>
-          <w:bCs/>
-        </w:rPr>
-        <w:t>to</w:t>
-      </w:r>
-      <w:proofErr w:type="spellEnd"/>
-      <w:r>
-        <w:rPr>
-          <w:bCs/>
-        </w:rPr>
-        <w:t xml:space="preserve"> Date</w:t>
+        <w:t>En este lado empezamos a renombrar atributos, también eliminar datos nulos, convertir los datos a sus respectivos tipo de datos (int, float, string, date) en este utilizamos los nodos Column Rename, String to Date</w:t>
       </w:r>
       <w:r>
         <w:rPr>
@@ -1504,6 +1866,337 @@
           <w:lang w:val="es-EC"/>
         </w:rPr>
         <w:t xml:space="preserve">&amp;Time </w:t>
+      </w:r>
+    </w:p>
+    <w:p>
+      <w:pPr>
+        <w:pStyle w:val="Prrafodelista"/>
+        <w:spacing w:after="240"/>
+        <w:ind w:left="1440"/>
+        <w:rPr>
+          <w:bCs/>
+        </w:rPr>
+      </w:pPr>
+      <w:r>
+        <w:rPr>
+          <w:bCs/>
+        </w:rPr>
+        <w:drawing>
+          <wp:inline distT="0" distB="0" distL="0" distR="0" wp14:anchorId="06EA2131" wp14:editId="5F081443">
+            <wp:extent cx="809738" cy="809738"/>
+            <wp:effectExtent l="0" t="0" r="9525" b="9525"/>
+            <wp:docPr id="901139339" name="Imagen 1"/>
+            <wp:cNvGraphicFramePr>
+              <a:graphicFrameLocks xmlns:a="http://schemas.openxmlformats.org/drawingml/2006/main" noChangeAspect="1"/>
+            </wp:cNvGraphicFramePr>
+            <a:graphic xmlns:a="http://schemas.openxmlformats.org/drawingml/2006/main">
+              <a:graphicData uri="http://schemas.openxmlformats.org/drawingml/2006/picture">
+                <pic:pic xmlns:pic="http://schemas.openxmlformats.org/drawingml/2006/picture">
+                  <pic:nvPicPr>
+                    <pic:cNvPr id="901139339" name=""/>
+                    <pic:cNvPicPr/>
+                  </pic:nvPicPr>
+                  <pic:blipFill>
+                    <a:blip r:embed="rId20"/>
+                    <a:stretch>
+                      <a:fillRect/>
+                    </a:stretch>
+                  </pic:blipFill>
+                  <pic:spPr>
+                    <a:xfrm>
+                      <a:off x="0" y="0"/>
+                      <a:ext cx="809738" cy="809738"/>
+                    </a:xfrm>
+                    <a:prstGeom prst="rect">
+                      <a:avLst/>
+                    </a:prstGeom>
+                  </pic:spPr>
+                </pic:pic>
+              </a:graphicData>
+            </a:graphic>
+          </wp:inline>
+        </w:drawing>
+      </w:r>
+    </w:p>
+    <w:p>
+      <w:pPr>
+        <w:pStyle w:val="Prrafodelista"/>
+        <w:spacing w:after="240"/>
+        <w:ind w:left="1440"/>
+        <w:rPr>
+          <w:bCs/>
+        </w:rPr>
+      </w:pPr>
+      <w:r>
+        <w:rPr>
+          <w:bCs/>
+        </w:rPr>
+        <w:lastRenderedPageBreak/>
+        <w:t>Renombrar cierta columna en otro nuevo.</w:t>
+      </w:r>
+    </w:p>
+    <w:p>
+      <w:pPr>
+        <w:pStyle w:val="Prrafodelista"/>
+        <w:spacing w:after="240"/>
+        <w:ind w:left="1440"/>
+        <w:rPr>
+          <w:bCs/>
+        </w:rPr>
+      </w:pPr>
+      <w:r>
+        <w:rPr>
+          <w:bCs/>
+        </w:rPr>
+        <w:drawing>
+          <wp:inline distT="0" distB="0" distL="0" distR="0" wp14:anchorId="0C24E61A" wp14:editId="7E9C2DF6">
+            <wp:extent cx="819264" cy="724001"/>
+            <wp:effectExtent l="0" t="0" r="0" b="0"/>
+            <wp:docPr id="1025949539" name="Imagen 1"/>
+            <wp:cNvGraphicFramePr>
+              <a:graphicFrameLocks xmlns:a="http://schemas.openxmlformats.org/drawingml/2006/main" noChangeAspect="1"/>
+            </wp:cNvGraphicFramePr>
+            <a:graphic xmlns:a="http://schemas.openxmlformats.org/drawingml/2006/main">
+              <a:graphicData uri="http://schemas.openxmlformats.org/drawingml/2006/picture">
+                <pic:pic xmlns:pic="http://schemas.openxmlformats.org/drawingml/2006/picture">
+                  <pic:nvPicPr>
+                    <pic:cNvPr id="1025949539" name=""/>
+                    <pic:cNvPicPr/>
+                  </pic:nvPicPr>
+                  <pic:blipFill>
+                    <a:blip r:embed="rId21"/>
+                    <a:stretch>
+                      <a:fillRect/>
+                    </a:stretch>
+                  </pic:blipFill>
+                  <pic:spPr>
+                    <a:xfrm>
+                      <a:off x="0" y="0"/>
+                      <a:ext cx="819264" cy="724001"/>
+                    </a:xfrm>
+                    <a:prstGeom prst="rect">
+                      <a:avLst/>
+                    </a:prstGeom>
+                  </pic:spPr>
+                </pic:pic>
+              </a:graphicData>
+            </a:graphic>
+          </wp:inline>
+        </w:drawing>
+      </w:r>
+    </w:p>
+    <w:p>
+      <w:pPr>
+        <w:pStyle w:val="Prrafodelista"/>
+        <w:spacing w:after="240"/>
+        <w:ind w:left="1440"/>
+        <w:rPr>
+          <w:bCs/>
+        </w:rPr>
+      </w:pPr>
+      <w:r>
+        <w:rPr>
+          <w:bCs/>
+        </w:rPr>
+        <w:t>Transformar tipo de dato string en numero.</w:t>
+      </w:r>
+    </w:p>
+    <w:p>
+      <w:pPr>
+        <w:pStyle w:val="Prrafodelista"/>
+        <w:spacing w:after="240"/>
+        <w:ind w:left="1440"/>
+        <w:rPr>
+          <w:bCs/>
+        </w:rPr>
+      </w:pPr>
+      <w:r>
+        <w:rPr>
+          <w:bCs/>
+        </w:rPr>
+        <w:drawing>
+          <wp:inline distT="0" distB="0" distL="0" distR="0" wp14:anchorId="228AFD0A" wp14:editId="491A33D3">
+            <wp:extent cx="781159" cy="828791"/>
+            <wp:effectExtent l="0" t="0" r="0" b="9525"/>
+            <wp:docPr id="1256284161" name="Imagen 1"/>
+            <wp:cNvGraphicFramePr>
+              <a:graphicFrameLocks xmlns:a="http://schemas.openxmlformats.org/drawingml/2006/main" noChangeAspect="1"/>
+            </wp:cNvGraphicFramePr>
+            <a:graphic xmlns:a="http://schemas.openxmlformats.org/drawingml/2006/main">
+              <a:graphicData uri="http://schemas.openxmlformats.org/drawingml/2006/picture">
+                <pic:pic xmlns:pic="http://schemas.openxmlformats.org/drawingml/2006/picture">
+                  <pic:nvPicPr>
+                    <pic:cNvPr id="1256284161" name=""/>
+                    <pic:cNvPicPr/>
+                  </pic:nvPicPr>
+                  <pic:blipFill>
+                    <a:blip r:embed="rId22"/>
+                    <a:stretch>
+                      <a:fillRect/>
+                    </a:stretch>
+                  </pic:blipFill>
+                  <pic:spPr>
+                    <a:xfrm>
+                      <a:off x="0" y="0"/>
+                      <a:ext cx="781159" cy="828791"/>
+                    </a:xfrm>
+                    <a:prstGeom prst="rect">
+                      <a:avLst/>
+                    </a:prstGeom>
+                  </pic:spPr>
+                </pic:pic>
+              </a:graphicData>
+            </a:graphic>
+          </wp:inline>
+        </w:drawing>
+      </w:r>
+    </w:p>
+    <w:p>
+      <w:pPr>
+        <w:pStyle w:val="Prrafodelista"/>
+        <w:spacing w:after="240"/>
+        <w:ind w:left="1440"/>
+        <w:rPr>
+          <w:bCs/>
+        </w:rPr>
+      </w:pPr>
+      <w:r>
+        <w:rPr>
+          <w:bCs/>
+        </w:rPr>
+        <w:t xml:space="preserve">Fixeo de datos nulos por nuevos datos o remover esa fila completamente </w:t>
+      </w:r>
+    </w:p>
+    <w:p>
+      <w:pPr>
+        <w:pStyle w:val="Prrafodelista"/>
+        <w:spacing w:after="240"/>
+        <w:ind w:left="1440"/>
+        <w:rPr>
+          <w:bCs/>
+        </w:rPr>
+      </w:pPr>
+      <w:r>
+        <w:rPr>
+          <w:bCs/>
+        </w:rPr>
+        <w:drawing>
+          <wp:inline distT="0" distB="0" distL="0" distR="0" wp14:anchorId="18153EAD" wp14:editId="02122188">
+            <wp:extent cx="752580" cy="762106"/>
+            <wp:effectExtent l="0" t="0" r="9525" b="0"/>
+            <wp:docPr id="321836583" name="Imagen 1"/>
+            <wp:cNvGraphicFramePr>
+              <a:graphicFrameLocks xmlns:a="http://schemas.openxmlformats.org/drawingml/2006/main" noChangeAspect="1"/>
+            </wp:cNvGraphicFramePr>
+            <a:graphic xmlns:a="http://schemas.openxmlformats.org/drawingml/2006/main">
+              <a:graphicData uri="http://schemas.openxmlformats.org/drawingml/2006/picture">
+                <pic:pic xmlns:pic="http://schemas.openxmlformats.org/drawingml/2006/picture">
+                  <pic:nvPicPr>
+                    <pic:cNvPr id="321836583" name=""/>
+                    <pic:cNvPicPr/>
+                  </pic:nvPicPr>
+                  <pic:blipFill>
+                    <a:blip r:embed="rId23"/>
+                    <a:stretch>
+                      <a:fillRect/>
+                    </a:stretch>
+                  </pic:blipFill>
+                  <pic:spPr>
+                    <a:xfrm>
+                      <a:off x="0" y="0"/>
+                      <a:ext cx="752580" cy="762106"/>
+                    </a:xfrm>
+                    <a:prstGeom prst="rect">
+                      <a:avLst/>
+                    </a:prstGeom>
+                  </pic:spPr>
+                </pic:pic>
+              </a:graphicData>
+            </a:graphic>
+          </wp:inline>
+        </w:drawing>
+      </w:r>
+    </w:p>
+    <w:p>
+      <w:pPr>
+        <w:pStyle w:val="Prrafodelista"/>
+        <w:spacing w:after="240"/>
+        <w:ind w:left="1440"/>
+        <w:rPr>
+          <w:bCs/>
+        </w:rPr>
+      </w:pPr>
+      <w:r>
+        <w:rPr>
+          <w:bCs/>
+        </w:rPr>
+        <w:t>Cambiar el nombre de una palabra especifica en una nueva</w:t>
+      </w:r>
+    </w:p>
+    <w:p>
+      <w:pPr>
+        <w:pStyle w:val="Prrafodelista"/>
+        <w:spacing w:after="240"/>
+        <w:ind w:left="1440"/>
+        <w:rPr>
+          <w:bCs/>
+        </w:rPr>
+      </w:pPr>
+      <w:r>
+        <w:rPr>
+          <w:bCs/>
+        </w:rPr>
+        <w:drawing>
+          <wp:inline distT="0" distB="0" distL="0" distR="0" wp14:anchorId="05B76A22" wp14:editId="686F5132">
+            <wp:extent cx="733527" cy="971686"/>
+            <wp:effectExtent l="0" t="0" r="0" b="0"/>
+            <wp:docPr id="1027848827" name="Imagen 1"/>
+            <wp:cNvGraphicFramePr>
+              <a:graphicFrameLocks xmlns:a="http://schemas.openxmlformats.org/drawingml/2006/main" noChangeAspect="1"/>
+            </wp:cNvGraphicFramePr>
+            <a:graphic xmlns:a="http://schemas.openxmlformats.org/drawingml/2006/main">
+              <a:graphicData uri="http://schemas.openxmlformats.org/drawingml/2006/picture">
+                <pic:pic xmlns:pic="http://schemas.openxmlformats.org/drawingml/2006/picture">
+                  <pic:nvPicPr>
+                    <pic:cNvPr id="1027848827" name=""/>
+                    <pic:cNvPicPr/>
+                  </pic:nvPicPr>
+                  <pic:blipFill>
+                    <a:blip r:embed="rId24"/>
+                    <a:stretch>
+                      <a:fillRect/>
+                    </a:stretch>
+                  </pic:blipFill>
+                  <pic:spPr>
+                    <a:xfrm>
+                      <a:off x="0" y="0"/>
+                      <a:ext cx="733527" cy="971686"/>
+                    </a:xfrm>
+                    <a:prstGeom prst="rect">
+                      <a:avLst/>
+                    </a:prstGeom>
+                  </pic:spPr>
+                </pic:pic>
+              </a:graphicData>
+            </a:graphic>
+          </wp:inline>
+        </w:drawing>
+      </w:r>
+    </w:p>
+    <w:p>
+      <w:pPr>
+        <w:pStyle w:val="Prrafodelista"/>
+        <w:spacing w:after="240"/>
+        <w:ind w:left="1440"/>
+        <w:rPr>
+          <w:bCs/>
+        </w:rPr>
+      </w:pPr>
+      <w:r>
+        <w:rPr>
+          <w:bCs/>
+        </w:rPr>
+        <w:t>Cambio de datos a datos tipo fecha</w:t>
       </w:r>
     </w:p>
     <w:p>
@@ -1523,23 +2216,85 @@
           <w:bCs/>
           <w:lang w:val="es-EC"/>
         </w:rPr>
-        <w:t xml:space="preserve">Integración de Conjuntos de Datos: Se unen todos los datos con el nodo </w:t>
-      </w:r>
-      <w:proofErr w:type="spellStart"/>
-      <w:r>
-        <w:rPr>
-          <w:bCs/>
-          <w:lang w:val="es-EC"/>
-        </w:rPr>
-        <w:t>concatenate</w:t>
-      </w:r>
-      <w:proofErr w:type="spellEnd"/>
-      <w:r>
-        <w:rPr>
-          <w:bCs/>
-          <w:lang w:val="es-EC"/>
-        </w:rPr>
-        <w:t xml:space="preserve"> esto para unificar registros en una sola tabla.</w:t>
+        <w:t>Integración de Conjuntos de Datos: Se unen todos los datos con el nodo concatenate esto para unificar registros en una sola tabla.</w:t>
+      </w:r>
+    </w:p>
+    <w:p>
+      <w:pPr>
+        <w:pStyle w:val="Prrafodelista"/>
+        <w:spacing w:after="240"/>
+        <w:ind w:left="1440"/>
+        <w:rPr>
+          <w:bCs/>
+        </w:rPr>
+      </w:pPr>
+      <w:r>
+        <w:rPr>
+          <w:bCs/>
+        </w:rPr>
+        <w:drawing>
+          <wp:inline distT="0" distB="0" distL="0" distR="0" wp14:anchorId="5EC499C9" wp14:editId="374C920E">
+            <wp:extent cx="895475" cy="885949"/>
+            <wp:effectExtent l="0" t="0" r="0" b="9525"/>
+            <wp:docPr id="113562262" name="Imagen 1"/>
+            <wp:cNvGraphicFramePr>
+              <a:graphicFrameLocks xmlns:a="http://schemas.openxmlformats.org/drawingml/2006/main" noChangeAspect="1"/>
+            </wp:cNvGraphicFramePr>
+            <a:graphic xmlns:a="http://schemas.openxmlformats.org/drawingml/2006/main">
+              <a:graphicData uri="http://schemas.openxmlformats.org/drawingml/2006/picture">
+                <pic:pic xmlns:pic="http://schemas.openxmlformats.org/drawingml/2006/picture">
+                  <pic:nvPicPr>
+                    <pic:cNvPr id="113562262" name=""/>
+                    <pic:cNvPicPr/>
+                  </pic:nvPicPr>
+                  <pic:blipFill>
+                    <a:blip r:embed="rId25"/>
+                    <a:stretch>
+                      <a:fillRect/>
+                    </a:stretch>
+                  </pic:blipFill>
+                  <pic:spPr>
+                    <a:xfrm>
+                      <a:off x="0" y="0"/>
+                      <a:ext cx="895475" cy="885949"/>
+                    </a:xfrm>
+                    <a:prstGeom prst="rect">
+                      <a:avLst/>
+                    </a:prstGeom>
+                  </pic:spPr>
+                </pic:pic>
+              </a:graphicData>
+            </a:graphic>
+          </wp:inline>
+        </w:drawing>
+      </w:r>
+    </w:p>
+    <w:p>
+      <w:pPr>
+        <w:pStyle w:val="Prrafodelista"/>
+        <w:spacing w:after="240"/>
+        <w:ind w:left="1440"/>
+        <w:rPr>
+          <w:bCs/>
+        </w:rPr>
+      </w:pPr>
+      <w:r>
+        <w:rPr>
+          <w:bCs/>
+        </w:rPr>
+        <w:t>Unir datos ya normalizados</w:t>
+      </w:r>
+      <w:r>
+        <w:rPr>
+          <w:bCs/>
+        </w:rPr>
+        <w:t xml:space="preserve"> y pasarlo a uno solo </w:t>
+      </w:r>
+      <w:r>
+        <w:rPr>
+          <w:bCs/>
+        </w:rPr>
+        <w:t xml:space="preserve"> </w:t>
       </w:r>
     </w:p>
     <w:p>
@@ -1559,30 +2314,126 @@
           <w:bCs/>
           <w:lang w:val="es-EC"/>
         </w:rPr>
-        <w:t xml:space="preserve">Fase de carga: Se convierte los datos que fueron transformados y validados en CVS con los nodos </w:t>
-      </w:r>
-      <w:proofErr w:type="spellStart"/>
+        <w:t>Fase de carga: Se convierte los datos que fueron transformados y validados en CS</w:t>
+      </w:r>
       <w:r>
         <w:rPr>
           <w:bCs/>
           <w:lang w:val="es-EC"/>
         </w:rPr>
-        <w:t>write</w:t>
-      </w:r>
-      <w:proofErr w:type="spellEnd"/>
+        <w:t>V</w:t>
+      </w:r>
       <w:r>
         <w:rPr>
           <w:bCs/>
           <w:lang w:val="es-EC"/>
         </w:rPr>
-        <w:t xml:space="preserve"> CVS esto debido al requerimiento del proyecto</w:t>
+        <w:t xml:space="preserve"> con los nodos write CS</w:t>
       </w:r>
       <w:r>
         <w:rPr>
           <w:bCs/>
           <w:lang w:val="es-EC"/>
         </w:rPr>
+        <w:t>V</w:t>
+      </w:r>
+      <w:r>
+        <w:rPr>
+          <w:bCs/>
+          <w:lang w:val="es-EC"/>
+        </w:rPr>
+        <w:t xml:space="preserve"> esto debido al requerimiento del proyecto</w:t>
+      </w:r>
+      <w:r>
+        <w:rPr>
+          <w:bCs/>
+          <w:lang w:val="es-EC"/>
+        </w:rPr>
         <w:t>.</w:t>
+      </w:r>
+    </w:p>
+    <w:p>
+      <w:pPr>
+        <w:pStyle w:val="Prrafodelista"/>
+        <w:spacing w:after="240"/>
+        <w:rPr>
+          <w:bCs/>
+          <w:lang w:val="es-EC"/>
+        </w:rPr>
+      </w:pPr>
+    </w:p>
+    <w:p>
+      <w:pPr>
+        <w:pStyle w:val="Prrafodelista"/>
+        <w:spacing w:after="240"/>
+        <w:rPr>
+          <w:bCs/>
+          <w:lang w:val="es-EC"/>
+        </w:rPr>
+      </w:pPr>
+    </w:p>
+    <w:p>
+      <w:pPr>
+        <w:pStyle w:val="Prrafodelista"/>
+        <w:spacing w:after="240"/>
+        <w:rPr>
+          <w:bCs/>
+        </w:rPr>
+      </w:pPr>
+      <w:r>
+        <w:rPr>
+          <w:bCs/>
+        </w:rPr>
+        <w:drawing>
+          <wp:inline distT="0" distB="0" distL="0" distR="0" wp14:anchorId="141A7D9F" wp14:editId="5751ECB7">
+            <wp:extent cx="1143160" cy="895475"/>
+            <wp:effectExtent l="0" t="0" r="0" b="0"/>
+            <wp:docPr id="697769873" name="Imagen 1"/>
+            <wp:cNvGraphicFramePr>
+              <a:graphicFrameLocks xmlns:a="http://schemas.openxmlformats.org/drawingml/2006/main" noChangeAspect="1"/>
+            </wp:cNvGraphicFramePr>
+            <a:graphic xmlns:a="http://schemas.openxmlformats.org/drawingml/2006/main">
+              <a:graphicData uri="http://schemas.openxmlformats.org/drawingml/2006/picture">
+                <pic:pic xmlns:pic="http://schemas.openxmlformats.org/drawingml/2006/picture">
+                  <pic:nvPicPr>
+                    <pic:cNvPr id="697769873" name=""/>
+                    <pic:cNvPicPr/>
+                  </pic:nvPicPr>
+                  <pic:blipFill>
+                    <a:blip r:embed="rId26"/>
+                    <a:stretch>
+                      <a:fillRect/>
+                    </a:stretch>
+                  </pic:blipFill>
+                  <pic:spPr>
+                    <a:xfrm>
+                      <a:off x="0" y="0"/>
+                      <a:ext cx="1143160" cy="895475"/>
+                    </a:xfrm>
+                    <a:prstGeom prst="rect">
+                      <a:avLst/>
+                    </a:prstGeom>
+                  </pic:spPr>
+                </pic:pic>
+              </a:graphicData>
+            </a:graphic>
+          </wp:inline>
+        </w:drawing>
+      </w:r>
+    </w:p>
+    <w:p>
+      <w:pPr>
+        <w:pStyle w:val="Prrafodelista"/>
+        <w:spacing w:after="240"/>
+        <w:rPr>
+          <w:bCs/>
+        </w:rPr>
+      </w:pPr>
+      <w:r>
+        <w:rPr>
+          <w:bCs/>
+        </w:rPr>
+        <w:t>Nodo para escribir en un nuevo campo tipo CSV el cual nos ayudara a ya tener datos limpios</w:t>
       </w:r>
     </w:p>
     <w:p>

</xml_diff>

<commit_message>
documentación de extracción y almacenamiento
</commit_message>
<xml_diff>
--- a/proyecto analisis.docx
+++ b/proyecto analisis.docx
@@ -241,7 +241,7 @@
                         </a:ln>
                         <a:extLst>
                           <a:ext uri="{909E8E84-426E-40dd-AFC4-6F175D3DCCD1}">
-                            <a14:hiddenFill xmlns:a14="http://schemas.microsoft.com/office/drawing/2010/main" xmlns:w="http://schemas.openxmlformats.org/wordprocessingml/2006/main" xmlns:w10="urn:schemas-microsoft-com:office:word" xmlns:v="urn:schemas-microsoft-com:vml" xmlns:o="urn:schemas-microsoft-com:office:office" xmlns:mv="urn:schemas-microsoft-com:mac:vml" xmlns:mo="http://schemas.microsoft.com/office/mac/office/2008/main" xmlns="">
+                            <a14:hiddenFill xmlns="" xmlns:mo="http://schemas.microsoft.com/office/mac/office/2008/main" xmlns:mv="urn:schemas-microsoft-com:mac:vml" xmlns:o="urn:schemas-microsoft-com:office:office" xmlns:v="urn:schemas-microsoft-com:vml" xmlns:w10="urn:schemas-microsoft-com:office:word" xmlns:w="http://schemas.openxmlformats.org/wordprocessingml/2006/main" xmlns:a14="http://schemas.microsoft.com/office/drawing/2010/main">
                               <a:noFill/>
                             </a14:hiddenFill>
                           </a:ext>
@@ -899,6 +899,204 @@
         </w:numPr>
         <w:spacing w:after="240"/>
         <w:rPr>
+          <w:b/>
+          <w:bCs/>
+          <w:lang w:val="es-EC"/>
+        </w:rPr>
+      </w:pPr>
+      <w:r>
+        <w:rPr>
+          <w:b/>
+          <w:bCs/>
+          <w:lang w:val="es-EC"/>
+        </w:rPr>
+        <w:t xml:space="preserve">Extracción de datos: </w:t>
+      </w:r>
+      <w:r>
+        <w:t>para la extracción de datos se utilizó jup</w:t>
+      </w:r>
+      <w:r>
+        <w:t>y</w:t>
+      </w:r>
+      <w:r>
+        <w:t>ter notebook el cual nos ayudó tanto a algunos archivos convertirlos ya sea en C</w:t>
+      </w:r>
+      <w:r>
+        <w:t xml:space="preserve">VS o JSON. </w:t>
+      </w:r>
+      <w:r>
+        <w:t>Al igual que también se logró recuperar desde archivos crudos C</w:t>
+      </w:r>
+      <w:r>
+        <w:t>V</w:t>
+      </w:r>
+      <w:r>
+        <w:t>S</w:t>
+      </w:r>
+      <w:r>
+        <w:t xml:space="preserve"> y </w:t>
+      </w:r>
+      <w:r>
+        <w:t>J</w:t>
+      </w:r>
+      <w:r>
+        <w:t>SON</w:t>
+      </w:r>
+      <w:r>
+        <w:t xml:space="preserve"> desde las propias páginas</w:t>
+      </w:r>
+      <w:r>
+        <w:t xml:space="preserve">. </w:t>
+      </w:r>
+      <w:r>
+        <w:t>Para el jupiter notebook lo que se implementó fue un script el cual nos ayude a convertir los datos que no eran legibles en metodología de máqu</w:t>
+      </w:r>
+      <w:r>
+        <w:t xml:space="preserve">ina </w:t>
+      </w:r>
+      <w:r>
+        <w:t>a transformarlas a ese tipo de metodología estas fueron casi la mayoría de archivos las cuales se pueden verificar mediante los ministerios del Ecuador encargados de recopilar estos datos</w:t>
+      </w:r>
+      <w:r>
+        <w:t xml:space="preserve">. </w:t>
+      </w:r>
+      <w:r>
+        <w:t>También se sacó este script la posibilidad de crear un dato no verificable y también creado desde la propia script</w:t>
+      </w:r>
+      <w:r>
+        <w:t xml:space="preserve">. </w:t>
+      </w:r>
+      <w:r>
+        <w:t>Para estos tipos de scripts que se llamó fue lo siguiente</w:t>
+      </w:r>
+      <w:r>
+        <w:t>:</w:t>
+      </w:r>
+    </w:p>
+    <w:p>
+      <w:pPr>
+        <w:pStyle w:val="Prrafodelista"/>
+        <w:numPr>
+          <w:ilvl w:val="1"/>
+          <w:numId w:val="26"/>
+        </w:numPr>
+        <w:spacing w:after="240"/>
+        <w:rPr>
+          <w:b/>
+          <w:bCs/>
+          <w:lang w:val="es-EC"/>
+        </w:rPr>
+      </w:pPr>
+      <w:r>
+        <w:rPr>
+          <w:lang w:val="en-US"/>
+        </w:rPr>
+        <w:t>Import pandas as pd f</w:t>
+      </w:r>
+      <w:r>
+        <w:rPr>
+          <w:lang w:val="en-US"/>
+        </w:rPr>
+        <w:t xml:space="preserve">rom pymongo import MongoCliente. </w:t>
+      </w:r>
+      <w:r>
+        <w:t>Este fue utilizado para llamar a un servidor no SQL el cual nos ayuda a traer datos que no sean tipo SQL</w:t>
+      </w:r>
+    </w:p>
+    <w:p>
+      <w:pPr>
+        <w:pStyle w:val="Prrafodelista"/>
+        <w:numPr>
+          <w:ilvl w:val="1"/>
+          <w:numId w:val="26"/>
+        </w:numPr>
+        <w:spacing w:after="240"/>
+        <w:rPr>
+          <w:b/>
+          <w:bCs/>
+          <w:lang w:val="es-EC"/>
+        </w:rPr>
+      </w:pPr>
+      <w:r>
+        <w:rPr>
+          <w:lang w:val="es-EC"/>
+        </w:rPr>
+        <w:t>Import pandas as pd from sqlalchemy import create_engine import urllib.parse. Este fue</w:t>
+      </w:r>
+      <w:r>
+        <w:t xml:space="preserve"> utilizado para llamar y crear una database tipo SQL para mysql y Server SQL los cuales ahí se van a encargar de ser manipulados por las aplicaciones my SQLY Server SQL</w:t>
+      </w:r>
+      <w:r>
+        <w:t>.</w:t>
+      </w:r>
+    </w:p>
+    <w:p>
+      <w:pPr>
+        <w:numPr>
+          <w:ilvl w:val="0"/>
+          <w:numId w:val="26"/>
+        </w:numPr>
+        <w:spacing w:after="240"/>
+        <w:rPr>
+          <w:b/>
+          <w:bCs/>
+          <w:lang w:val="es-EC"/>
+        </w:rPr>
+      </w:pPr>
+      <w:r>
+        <w:rPr>
+          <w:b/>
+          <w:bCs/>
+          <w:lang w:val="es-EC"/>
+        </w:rPr>
+        <w:t xml:space="preserve">Almacenamiento de datos: </w:t>
+      </w:r>
+      <w:r>
+        <w:t>Para el almacenamiento de datos</w:t>
+      </w:r>
+      <w:r>
+        <w:t xml:space="preserve">, </w:t>
+      </w:r>
+      <w:r>
+        <w:t xml:space="preserve">se utilizó un igual un script IPYNB jupiter </w:t>
+      </w:r>
+      <w:r>
+        <w:lastRenderedPageBreak/>
+        <w:t xml:space="preserve">notebook el cual le utilizamos importaciones como SQLalchemy y pymySQL los cuales nos ayudaron a importar los datos tanto </w:t>
+      </w:r>
+      <w:r>
+        <w:t>CVS</w:t>
+      </w:r>
+      <w:r>
+        <w:t xml:space="preserve"> y </w:t>
+      </w:r>
+      <w:r>
+        <w:t>JSON</w:t>
+      </w:r>
+      <w:r>
+        <w:t xml:space="preserve"> para</w:t>
+      </w:r>
+      <w:r>
+        <w:t xml:space="preserve"> </w:t>
+      </w:r>
+      <w:r>
+        <w:t>La ingesta y almacenamiento de datos tanto SQL</w:t>
+      </w:r>
+      <w:r>
+        <w:t xml:space="preserve"> y</w:t>
+      </w:r>
+      <w:r>
+        <w:t xml:space="preserve"> noSQL</w:t>
+      </w:r>
+    </w:p>
+    <w:p>
+      <w:pPr>
+        <w:numPr>
+          <w:ilvl w:val="0"/>
+          <w:numId w:val="26"/>
+        </w:numPr>
+        <w:spacing w:after="240"/>
+        <w:rPr>
           <w:bCs/>
           <w:lang w:val="es-EC"/>
         </w:rPr>
@@ -1116,7 +1314,6 @@
         <w:rPr>
           <w:bCs/>
         </w:rPr>
-        <w:lastRenderedPageBreak/>
         <w:t>Inec enemdu consumido, mies bonos pensiones,</w:t>
       </w:r>
     </w:p>
@@ -1227,6 +1424,7 @@
       <w:r>
         <w:rPr>
           <w:bCs/>
+          <w:noProof/>
         </w:rPr>
         <w:drawing>
           <wp:inline distT="0" distB="0" distL="0" distR="0" wp14:anchorId="4235873D" wp14:editId="1A91F5BF">
@@ -1293,6 +1491,7 @@
       <w:r>
         <w:rPr>
           <w:bCs/>
+          <w:noProof/>
         </w:rPr>
         <w:drawing>
           <wp:inline distT="0" distB="0" distL="0" distR="0" wp14:anchorId="25484A49" wp14:editId="6156A4DD">
@@ -1365,6 +1564,7 @@
       <w:r>
         <w:rPr>
           <w:bCs/>
+          <w:noProof/>
         </w:rPr>
         <w:drawing>
           <wp:inline distT="0" distB="0" distL="0" distR="0" wp14:anchorId="62635E59" wp14:editId="192772F2">
@@ -1431,6 +1631,7 @@
       <w:r>
         <w:rPr>
           <w:bCs/>
+          <w:noProof/>
         </w:rPr>
         <w:drawing>
           <wp:inline distT="0" distB="0" distL="0" distR="0" wp14:anchorId="7A9AF501" wp14:editId="25B61523">
@@ -1497,6 +1698,7 @@
       <w:r>
         <w:rPr>
           <w:bCs/>
+          <w:noProof/>
         </w:rPr>
         <w:drawing>
           <wp:inline distT="0" distB="0" distL="0" distR="0" wp14:anchorId="38267939" wp14:editId="37054F0F">
@@ -1548,6 +1750,7 @@
         <w:rPr>
           <w:bCs/>
         </w:rPr>
+        <w:lastRenderedPageBreak/>
         <w:t>Excel para revisión de datos en formato de tabla</w:t>
       </w:r>
     </w:p>
@@ -1594,6 +1797,7 @@
       <w:r>
         <w:rPr>
           <w:bCs/>
+          <w:noProof/>
         </w:rPr>
         <w:drawing>
           <wp:inline distT="0" distB="0" distL="0" distR="0" wp14:anchorId="67488F5D" wp14:editId="65B0D4C0">
@@ -1660,6 +1864,7 @@
       <w:r>
         <w:rPr>
           <w:bCs/>
+          <w:noProof/>
         </w:rPr>
         <w:drawing>
           <wp:inline distT="0" distB="0" distL="0" distR="0" wp14:anchorId="29173878" wp14:editId="7ADE233D">
@@ -1726,6 +1931,7 @@
       <w:r>
         <w:rPr>
           <w:bCs/>
+          <w:noProof/>
         </w:rPr>
         <w:drawing>
           <wp:inline distT="0" distB="0" distL="0" distR="0" wp14:anchorId="2938EEC2" wp14:editId="082C629E">
@@ -1798,6 +2004,7 @@
       <w:r>
         <w:rPr>
           <w:bCs/>
+          <w:noProof/>
         </w:rPr>
         <w:drawing>
           <wp:inline distT="0" distB="0" distL="0" distR="0" wp14:anchorId="7C8A5B12" wp14:editId="62D4B274">
@@ -1880,6 +2087,7 @@
       <w:r>
         <w:rPr>
           <w:bCs/>
+          <w:noProof/>
         </w:rPr>
         <w:drawing>
           <wp:inline distT="0" distB="0" distL="0" distR="0" wp14:anchorId="06EA2131" wp14:editId="5F081443">
@@ -1931,7 +2139,6 @@
         <w:rPr>
           <w:bCs/>
         </w:rPr>
-        <w:lastRenderedPageBreak/>
         <w:t>Renombrar cierta columna en otro nuevo.</w:t>
       </w:r>
     </w:p>
@@ -1947,6 +2154,7 @@
       <w:r>
         <w:rPr>
           <w:bCs/>
+          <w:noProof/>
         </w:rPr>
         <w:drawing>
           <wp:inline distT="0" distB="0" distL="0" distR="0" wp14:anchorId="0C24E61A" wp14:editId="7E9C2DF6">
@@ -2013,6 +2221,7 @@
       <w:r>
         <w:rPr>
           <w:bCs/>
+          <w:noProof/>
         </w:rPr>
         <w:drawing>
           <wp:inline distT="0" distB="0" distL="0" distR="0" wp14:anchorId="228AFD0A" wp14:editId="491A33D3">
@@ -2079,6 +2288,7 @@
       <w:r>
         <w:rPr>
           <w:bCs/>
+          <w:noProof/>
         </w:rPr>
         <w:drawing>
           <wp:inline distT="0" distB="0" distL="0" distR="0" wp14:anchorId="18153EAD" wp14:editId="02122188">
@@ -2145,6 +2355,7 @@
       <w:r>
         <w:rPr>
           <w:bCs/>
+          <w:noProof/>
         </w:rPr>
         <w:drawing>
           <wp:inline distT="0" distB="0" distL="0" distR="0" wp14:anchorId="05B76A22" wp14:editId="686F5132">
@@ -2231,6 +2442,7 @@
       <w:r>
         <w:rPr>
           <w:bCs/>
+          <w:noProof/>
         </w:rPr>
         <w:drawing>
           <wp:inline distT="0" distB="0" distL="0" distR="0" wp14:anchorId="5EC499C9" wp14:editId="374C920E">
@@ -2314,13 +2526,21 @@
           <w:bCs/>
           <w:lang w:val="es-EC"/>
         </w:rPr>
-        <w:t>Fase de carga: Se convierte los datos que fueron transformados y validados en CS</w:t>
+        <w:t xml:space="preserve">Fase de carga: Se convierte los datos que fueron transformados y validados en </w:t>
       </w:r>
       <w:r>
         <w:rPr>
           <w:bCs/>
           <w:lang w:val="es-EC"/>
         </w:rPr>
+        <w:lastRenderedPageBreak/>
+        <w:t>CS</w:t>
+      </w:r>
+      <w:r>
+        <w:rPr>
+          <w:bCs/>
+          <w:lang w:val="es-EC"/>
+        </w:rPr>
         <w:t>V</w:t>
       </w:r>
       <w:r>
@@ -2383,6 +2603,7 @@
       <w:r>
         <w:rPr>
           <w:bCs/>
+          <w:noProof/>
         </w:rPr>
         <w:drawing>
           <wp:inline distT="0" distB="0" distL="0" distR="0" wp14:anchorId="141A7D9F" wp14:editId="5751ECB7">

</xml_diff>